<commit_message>
Update story document of statistics
git-svn-id: http://192.168.20.11/sequoiadb/trunk@38533 6121f079-4a18-41d3-8c30-8870a322f2c2
</commit_message>
<xml_diff>
--- a/internal_doc/03.开发设计/Story-操作统计信息查询.docx
+++ b/internal_doc/03.开发设计/Story-操作统计信息查询.docx
@@ -433,10 +433,10 @@
         <w:tblLook w:val="04A0" w:firstRow="1" w:lastRow="0" w:firstColumn="1" w:lastColumn="0" w:noHBand="0" w:noVBand="1"/>
       </w:tblPr>
       <w:tblGrid>
-        <w:gridCol w:w="2361"/>
-        <w:gridCol w:w="1133"/>
+        <w:gridCol w:w="2339"/>
+        <w:gridCol w:w="1257"/>
         <w:gridCol w:w="753"/>
-        <w:gridCol w:w="4275"/>
+        <w:gridCol w:w="4173"/>
       </w:tblGrid>
       <w:tr>
         <w:tc>
@@ -545,12 +545,20 @@
                 <w:szCs w:val="18"/>
               </w:rPr>
             </w:pPr>
+            <w:commentRangeStart w:id="2"/>
             <w:r>
               <w:rPr>
                 <w:sz w:val="18"/>
                 <w:szCs w:val="18"/>
               </w:rPr>
               <w:t>Statistic</w:t>
+            </w:r>
+            <w:commentRangeEnd w:id="2"/>
+            <w:r>
+              <w:rPr>
+                <w:rStyle w:val="ad"/>
+              </w:rPr>
+              <w:commentReference w:id="2"/>
             </w:r>
           </w:p>
         </w:tc>
@@ -775,7 +783,31 @@
                 <w:sz w:val="18"/>
                 <w:szCs w:val="18"/>
               </w:rPr>
-              <w:t>Write.nInserted</w:t>
+              <w:t>Write.</w:t>
+            </w:r>
+            <w:commentRangeStart w:id="3"/>
+            <w:r>
+              <w:rPr>
+                <w:rFonts w:hint="eastAsia"/>
+                <w:sz w:val="18"/>
+                <w:szCs w:val="18"/>
+              </w:rPr>
+              <w:t>I</w:t>
+            </w:r>
+            <w:r>
+              <w:rPr>
+                <w:rFonts w:hint="eastAsia"/>
+                <w:sz w:val="18"/>
+                <w:szCs w:val="18"/>
+              </w:rPr>
+              <w:t>nserted</w:t>
+            </w:r>
+            <w:commentRangeEnd w:id="3"/>
+            <w:r>
+              <w:rPr>
+                <w:rStyle w:val="ad"/>
+              </w:rPr>
+              <w:commentReference w:id="3"/>
             </w:r>
           </w:p>
         </w:tc>
@@ -864,7 +896,15 @@
                 <w:sz w:val="18"/>
                 <w:szCs w:val="18"/>
               </w:rPr>
-              <w:t>Write.nMatched</w:t>
+              <w:t>Write.</w:t>
+            </w:r>
+            <w:r>
+              <w:rPr>
+                <w:rFonts w:hint="eastAsia"/>
+                <w:sz w:val="18"/>
+                <w:szCs w:val="18"/>
+              </w:rPr>
+              <w:t>Matched</w:t>
             </w:r>
           </w:p>
         </w:tc>
@@ -1170,6 +1210,7 @@
                 <w:szCs w:val="18"/>
               </w:rPr>
             </w:pPr>
+            <w:commentRangeStart w:id="4"/>
             <w:r>
               <w:rPr>
                 <w:rFonts w:hint="eastAsia"/>
@@ -1177,6 +1218,13 @@
                 <w:szCs w:val="18"/>
               </w:rPr>
               <w:t>INT32</w:t>
+            </w:r>
+            <w:commentRangeEnd w:id="4"/>
+            <w:r>
+              <w:rPr>
+                <w:rStyle w:val="ad"/>
+              </w:rPr>
+              <w:commentReference w:id="4"/>
             </w:r>
           </w:p>
         </w:tc>
@@ -1277,7 +1325,14 @@
         <w:rPr>
           <w:rFonts w:hint="eastAsia"/>
         </w:rPr>
-        <w:t>：只更改</w:t>
+        <w:t>：</w:t>
+      </w:r>
+      <w:commentRangeStart w:id="5"/>
+      <w:r>
+        <w:rPr>
+          <w:rFonts w:hint="eastAsia"/>
+        </w:rPr>
+        <w:t>只更改</w:t>
       </w:r>
       <w:r>
         <w:rPr>
@@ -1289,7 +1344,20 @@
         <w:rPr>
           <w:rFonts w:hint="eastAsia"/>
         </w:rPr>
-        <w:t>的值，其值为成功插入的记录数</w:t>
+        <w:t>的值，其</w:t>
+      </w:r>
+      <w:commentRangeEnd w:id="5"/>
+      <w:r>
+        <w:rPr>
+          <w:rStyle w:val="ad"/>
+        </w:rPr>
+        <w:commentReference w:id="5"/>
+      </w:r>
+      <w:r>
+        <w:rPr>
+          <w:rFonts w:hint="eastAsia"/>
+        </w:rPr>
+        <w:t>值为成功插入的记录数</w:t>
       </w:r>
     </w:p>
     <w:p>
@@ -1498,12 +1566,23 @@
       <w:pPr>
         <w:pStyle w:val="4"/>
       </w:pPr>
+      <w:commentRangeStart w:id="6"/>
       <w:r>
         <w:rPr>
           <w:rFonts w:hint="eastAsia"/>
         </w:rPr>
         <w:t>驱动接口变更</w:t>
       </w:r>
+      <w:commentRangeEnd w:id="6"/>
+      <w:r>
+        <w:rPr>
+          <w:rStyle w:val="ad"/>
+          <w:rFonts w:asciiTheme="minorHAnsi" w:eastAsiaTheme="minorEastAsia" w:hAnsiTheme="minorHAnsi" w:cstheme="minorBidi"/>
+          <w:b w:val="0"/>
+          <w:bCs w:val="0"/>
+        </w:rPr>
+        <w:commentReference w:id="6"/>
+      </w:r>
     </w:p>
     <w:p>
       <w:pPr>
@@ -1515,12 +1594,20 @@
         </w:rPr>
         <w:t>驱动提供接口</w:t>
       </w:r>
+      <w:commentRangeStart w:id="7"/>
       <w:r>
         <w:rPr>
           <w:rFonts w:hint="eastAsia"/>
         </w:rPr>
         <w:t xml:space="preserve">getLastStatistic </w:t>
       </w:r>
+      <w:commentRangeEnd w:id="7"/>
+      <w:r>
+        <w:rPr>
+          <w:rStyle w:val="ad"/>
+        </w:rPr>
+        <w:commentReference w:id="7"/>
+      </w:r>
       <w:r>
         <w:rPr>
           <w:rFonts w:hint="eastAsia"/>
@@ -1633,6 +1720,8 @@
       <w:r>
         <w:tab/>
       </w:r>
+      <w:commentRangeStart w:id="8"/>
+      <w:commentRangeStart w:id="9"/>
       <w:r>
         <w:t>s</w:t>
       </w:r>
@@ -1650,6 +1739,26 @@
           <w:rFonts w:hint="eastAsia"/>
         </w:rPr>
         <w:t>变更</w:t>
+      </w:r>
+      <w:commentRangeEnd w:id="8"/>
+      <w:r>
+        <w:rPr>
+          <w:rStyle w:val="ad"/>
+          <w:rFonts w:asciiTheme="minorHAnsi" w:eastAsiaTheme="minorEastAsia" w:hAnsiTheme="minorHAnsi" w:cstheme="minorBidi"/>
+          <w:b w:val="0"/>
+          <w:bCs w:val="0"/>
+        </w:rPr>
+        <w:commentReference w:id="8"/>
+      </w:r>
+      <w:commentRangeEnd w:id="9"/>
+      <w:r>
+        <w:rPr>
+          <w:rStyle w:val="ad"/>
+          <w:rFonts w:asciiTheme="minorHAnsi" w:eastAsiaTheme="minorEastAsia" w:hAnsiTheme="minorHAnsi" w:cstheme="minorBidi"/>
+          <w:b w:val="0"/>
+          <w:bCs w:val="0"/>
+        </w:rPr>
+        <w:commentReference w:id="9"/>
       </w:r>
     </w:p>
     <w:p>
@@ -2072,7 +2181,7 @@
                     <pic:cNvPicPr/>
                   </pic:nvPicPr>
                   <pic:blipFill>
-                    <a:blip r:embed="rId7">
+                    <a:blip r:embed="rId9">
                       <a:extLst>
                         <a:ext uri="{28A0092B-C50C-407E-A947-70E740481C1C}">
                           <a14:useLocalDpi xmlns:a14="http://schemas.microsoft.com/office/drawing/2010/main" val="0"/>
@@ -2136,7 +2245,7 @@
                     <pic:cNvPicPr/>
                   </pic:nvPicPr>
                   <pic:blipFill>
-                    <a:blip r:embed="rId8">
+                    <a:blip r:embed="rId10">
                       <a:extLst>
                         <a:ext uri="{28A0092B-C50C-407E-A947-70E740481C1C}">
                           <a14:useLocalDpi xmlns:a14="http://schemas.microsoft.com/office/drawing/2010/main" val="0"/>
@@ -2410,7 +2519,7 @@
                     <pic:cNvPicPr/>
                   </pic:nvPicPr>
                   <pic:blipFill>
-                    <a:blip r:embed="rId9">
+                    <a:blip r:embed="rId11">
                       <a:extLst>
                         <a:ext uri="{28A0092B-C50C-407E-A947-70E740481C1C}">
                           <a14:useLocalDpi xmlns:a14="http://schemas.microsoft.com/office/drawing/2010/main" val="0"/>
@@ -2481,6 +2590,7 @@
       <w:pPr>
         <w:jc w:val="center"/>
       </w:pPr>
+      <w:commentRangeStart w:id="10"/>
       <w:r>
         <w:rPr>
           <w:rFonts w:hint="eastAsia"/>
@@ -2502,7 +2612,7 @@
                     <pic:cNvPicPr/>
                   </pic:nvPicPr>
                   <pic:blipFill>
-                    <a:blip r:embed="rId10">
+                    <a:blip r:embed="rId12">
                       <a:extLst>
                         <a:ext uri="{28A0092B-C50C-407E-A947-70E740481C1C}">
                           <a14:useLocalDpi xmlns:a14="http://schemas.microsoft.com/office/drawing/2010/main" val="0"/>
@@ -2528,6 +2638,13 @@
           </wp:inline>
         </w:drawing>
       </w:r>
+      <w:commentRangeEnd w:id="10"/>
+      <w:r>
+        <w:rPr>
+          <w:rStyle w:val="ad"/>
+        </w:rPr>
+        <w:commentReference w:id="10"/>
+      </w:r>
     </w:p>
     <w:p>
       <w:pPr>
@@ -2645,7 +2762,7 @@
                     <pic:cNvPicPr/>
                   </pic:nvPicPr>
                   <pic:blipFill>
-                    <a:blip r:embed="rId11">
+                    <a:blip r:embed="rId13">
                       <a:extLst>
                         <a:ext uri="{28A0092B-C50C-407E-A947-70E740481C1C}">
                           <a14:useLocalDpi xmlns:a14="http://schemas.microsoft.com/office/drawing/2010/main" val="0"/>
@@ -2900,6 +3017,7 @@
       <w:pPr>
         <w:pStyle w:val="5"/>
       </w:pPr>
+      <w:commentRangeStart w:id="11"/>
       <w:r>
         <w:rPr>
           <w:rFonts w:hint="eastAsia"/>
@@ -2911,6 +3029,15 @@
           <w:rFonts w:hint="eastAsia"/>
         </w:rPr>
         <w:t>存储</w:t>
+      </w:r>
+      <w:commentRangeEnd w:id="11"/>
+      <w:r>
+        <w:rPr>
+          <w:rStyle w:val="ad"/>
+          <w:rFonts w:asciiTheme="minorHAnsi" w:eastAsiaTheme="minorEastAsia" w:hAnsiTheme="minorHAnsi" w:cstheme="minorBidi"/>
+          <w:color w:val="auto"/>
+        </w:rPr>
+        <w:commentReference w:id="11"/>
       </w:r>
     </w:p>
     <w:p>
@@ -3115,7 +3242,7 @@
                     </pic:cNvPicPr>
                   </pic:nvPicPr>
                   <pic:blipFill>
-                    <a:blip r:embed="rId12">
+                    <a:blip r:embed="rId14">
                       <a:extLst>
                         <a:ext uri="{28A0092B-C50C-407E-A947-70E740481C1C}">
                           <a14:useLocalDpi xmlns:a14="http://schemas.microsoft.com/office/drawing/2010/main" val="0"/>
@@ -3334,7 +3461,7 @@
                     <pic:cNvPicPr/>
                   </pic:nvPicPr>
                   <pic:blipFill>
-                    <a:blip r:embed="rId13">
+                    <a:blip r:embed="rId15">
                       <a:extLst>
                         <a:ext uri="{28A0092B-C50C-407E-A947-70E740481C1C}">
                           <a14:useLocalDpi xmlns:a14="http://schemas.microsoft.com/office/drawing/2010/main" val="0"/>
@@ -3363,12 +3490,36 @@
     </w:p>
     <w:p>
       <w:pPr>
+        <w:jc w:val="left"/>
+      </w:pPr>
+      <w:r>
+        <w:rPr>
+          <w:rFonts w:hint="eastAsia"/>
+        </w:rPr>
+        <w:t>对统计信息的聚合，放在协调节点上相关操作符类的应答消息处理中，即各处理类的</w:t>
+      </w:r>
+      <w:r>
+        <w:rPr>
+          <w:rFonts w:hint="eastAsia"/>
+        </w:rPr>
+        <w:t xml:space="preserve"> _onNodeReply </w:t>
+      </w:r>
+      <w:r>
+        <w:rPr>
+          <w:rFonts w:hint="eastAsia"/>
+        </w:rPr>
+        <w:t>回调函数中。该函数在有节点应答时调用，协调节点从中取出统计信息进行累加。</w:t>
+      </w:r>
+    </w:p>
+    <w:p>
+      <w:pPr>
         <w:pStyle w:val="4"/>
       </w:pPr>
       <w:r>
         <w:rPr>
           <w:rFonts w:hint="eastAsia"/>
         </w:rPr>
+        <w:lastRenderedPageBreak/>
         <w:t>驱动</w:t>
       </w:r>
       <w:r>
@@ -3436,14 +3587,7 @@
         <w:rPr>
           <w:rFonts w:hint="eastAsia"/>
         </w:rPr>
-        <w:t>发送消息到服务</w:t>
-      </w:r>
-      <w:r>
-        <w:rPr>
-          <w:rFonts w:hint="eastAsia"/>
-        </w:rPr>
-        <w:lastRenderedPageBreak/>
-        <w:t>端</w:t>
+        <w:t>发送消息到服务端</w:t>
       </w:r>
       <w:r>
         <w:rPr>
@@ -4329,6 +4473,7 @@
         <w:rPr>
           <w:rFonts w:hint="eastAsia"/>
         </w:rPr>
+        <w:lastRenderedPageBreak/>
         <w:t>验收</w:t>
       </w:r>
       <w:r>
@@ -4554,14 +4699,7 @@
               <w:rPr>
                 <w:rFonts w:hint="eastAsia"/>
               </w:rPr>
-              <w:t>的单条插入接口正常插入一条记</w:t>
-            </w:r>
-            <w:r>
-              <w:rPr>
-                <w:rFonts w:hint="eastAsia"/>
-              </w:rPr>
-              <w:lastRenderedPageBreak/>
-              <w:t>录</w:t>
+              <w:t>的单条插入接口正常插入一条记录</w:t>
             </w:r>
           </w:p>
           <w:p>
@@ -4606,7 +4744,6 @@
               <w:rPr>
                 <w:rFonts w:hint="eastAsia"/>
               </w:rPr>
-              <w:lastRenderedPageBreak/>
               <w:t>能正常查询到统计信息，</w:t>
             </w:r>
             <w:r>
@@ -4625,7 +4762,6 @@
               <w:rPr>
                 <w:rFonts w:hint="eastAsia"/>
               </w:rPr>
-              <w:lastRenderedPageBreak/>
               <w:t>值为１，其余字段值为０</w:t>
             </w:r>
           </w:p>
@@ -4641,7 +4777,6 @@
               <w:ind w:left="0"/>
             </w:pPr>
             <w:r>
-              <w:lastRenderedPageBreak/>
               <w:t>2</w:t>
             </w:r>
           </w:p>
@@ -5576,14 +5711,8 @@
               <w:rPr>
                 <w:rFonts w:hint="eastAsia"/>
               </w:rPr>
-              <w:t>在出错的情况下，则出错操作的统计信息中，要将本事务中之前操作的回滚动作的数据变更计算</w:t>
-            </w:r>
-            <w:r>
-              <w:rPr>
-                <w:rFonts w:hint="eastAsia"/>
-              </w:rPr>
               <w:lastRenderedPageBreak/>
-              <w:t>在内</w:t>
+              <w:t>在出错的情况下，则出错操作的统计信息中，要将本事务中之前操作的回滚动作的数据变更计算在内</w:t>
             </w:r>
           </w:p>
         </w:tc>
@@ -6066,8 +6195,6 @@
       <w:pPr>
         <w:ind w:left="0"/>
       </w:pPr>
-      <w:bookmarkStart w:id="2" w:name="_GoBack"/>
-      <w:bookmarkEnd w:id="2"/>
     </w:p>
     <w:sectPr>
       <w:pgSz w:w="11906" w:h="16838"/>
@@ -6077,6 +6204,414 @@
     </w:sectPr>
   </w:body>
 </w:document>
+</file>
+
+<file path=word/comments.xml><?xml version="1.0" encoding="utf-8"?>
+<w:comments xmlns:wpc="http://schemas.microsoft.com/office/word/2010/wordprocessingCanvas" xmlns:cx="http://schemas.microsoft.com/office/drawing/2014/chartex" xmlns:mc="http://schemas.openxmlformats.org/markup-compatibility/2006" xmlns:o="urn:schemas-microsoft-com:office:office" xmlns:r="http://schemas.openxmlformats.org/officeDocument/2006/relationships" xmlns:m="http://schemas.openxmlformats.org/officeDocument/2006/math" xmlns:v="urn:schemas-microsoft-com:vml" xmlns:wp14="http://schemas.microsoft.com/office/word/2010/wordprocessingDrawing" xmlns:wp="http://schemas.openxmlformats.org/drawingml/2006/wordprocessingDrawing" xmlns:w10="urn:schemas-microsoft-com:office:word" xmlns:w="http://schemas.openxmlformats.org/wordprocessingml/2006/main" xmlns:w14="http://schemas.microsoft.com/office/word/2010/wordml" xmlns:w15="http://schemas.microsoft.com/office/word/2012/wordml" xmlns:w16se="http://schemas.microsoft.com/office/word/2015/wordml/symex" xmlns:wpg="http://schemas.microsoft.com/office/word/2010/wordprocessingGroup" xmlns:wpi="http://schemas.microsoft.com/office/word/2010/wordprocessingInk" xmlns:wne="http://schemas.microsoft.com/office/word/2006/wordml" xmlns:wps="http://schemas.microsoft.com/office/word/2010/wordprocessingShape" mc:Ignorable="w14 w15 w16se wp14">
+  <w:comment w:id="2" w:author="yangshangde" w:date="2018-12-22T13:49:00Z" w:initials="y">
+    <w:p>
+      <w:pPr>
+        <w:pStyle w:val="ae"/>
+      </w:pPr>
+      <w:r>
+        <w:rPr>
+          <w:rStyle w:val="ad"/>
+        </w:rPr>
+        <w:annotationRef/>
+      </w:r>
+      <w:r>
+        <w:rPr>
+          <w:rFonts w:hint="eastAsia"/>
+        </w:rPr>
+        <w:t>保留一层即可，去掉</w:t>
+      </w:r>
+      <w:r>
+        <w:rPr>
+          <w:rFonts w:hint="eastAsia"/>
+        </w:rPr>
+        <w:t xml:space="preserve">statistic </w:t>
+      </w:r>
+      <w:r>
+        <w:rPr>
+          <w:rFonts w:hint="eastAsia"/>
+        </w:rPr>
+        <w:t>层</w:t>
+      </w:r>
+    </w:p>
+  </w:comment>
+  <w:comment w:id="3" w:author="yangshangde" w:date="2018-12-22T13:47:00Z" w:initials="y">
+    <w:p>
+      <w:pPr>
+        <w:pStyle w:val="ae"/>
+      </w:pPr>
+      <w:r>
+        <w:rPr>
+          <w:rStyle w:val="ad"/>
+        </w:rPr>
+        <w:annotationRef/>
+      </w:r>
+      <w:r>
+        <w:rPr>
+          <w:rFonts w:hint="eastAsia"/>
+        </w:rPr>
+        <w:t>名称调整：</w:t>
+      </w:r>
+      <w:r>
+        <w:t>InsertCount</w:t>
+      </w:r>
+    </w:p>
+    <w:p>
+      <w:pPr>
+        <w:pStyle w:val="ae"/>
+        <w:rPr>
+          <w:rFonts w:hint="eastAsia"/>
+        </w:rPr>
+      </w:pPr>
+      <w:r>
+        <w:rPr>
+          <w:rFonts w:hint="eastAsia"/>
+        </w:rPr>
+        <w:t>添加</w:t>
+      </w:r>
+      <w:r>
+        <w:rPr>
+          <w:rFonts w:hint="eastAsia"/>
+        </w:rPr>
+        <w:t xml:space="preserve"> IgnoreCount</w:t>
+      </w:r>
+    </w:p>
+  </w:comment>
+  <w:comment w:id="4" w:author="yangshangde" w:date="2018-12-22T13:52:00Z" w:initials="y">
+    <w:p>
+      <w:pPr>
+        <w:pStyle w:val="ae"/>
+      </w:pPr>
+      <w:r>
+        <w:rPr>
+          <w:rStyle w:val="ad"/>
+        </w:rPr>
+        <w:annotationRef/>
+      </w:r>
+      <w:r>
+        <w:rPr>
+          <w:rFonts w:hint="eastAsia"/>
+        </w:rPr>
+        <w:t>类型统一为</w:t>
+      </w:r>
+      <w:r>
+        <w:rPr>
+          <w:rFonts w:hint="eastAsia"/>
+        </w:rPr>
+        <w:t xml:space="preserve"> INT64</w:t>
+      </w:r>
+    </w:p>
+  </w:comment>
+  <w:comment w:id="5" w:author="yangshangde" w:date="2018-12-22T13:53:00Z" w:initials="y">
+    <w:p>
+      <w:pPr>
+        <w:pStyle w:val="ae"/>
+      </w:pPr>
+      <w:r>
+        <w:rPr>
+          <w:rStyle w:val="ad"/>
+        </w:rPr>
+        <w:annotationRef/>
+      </w:r>
+      <w:r>
+        <w:rPr>
+          <w:rFonts w:hint="eastAsia"/>
+        </w:rPr>
+        <w:t>加上</w:t>
+      </w:r>
+      <w:r>
+        <w:rPr>
+          <w:rFonts w:hint="eastAsia"/>
+        </w:rPr>
+        <w:t xml:space="preserve"> IgnoreCount</w:t>
+      </w:r>
+    </w:p>
+  </w:comment>
+  <w:comment w:id="6" w:author="yangshangde" w:date="2018-12-22T14:25:00Z" w:initials="y">
+    <w:p>
+      <w:pPr>
+        <w:pStyle w:val="ae"/>
+      </w:pPr>
+      <w:r>
+        <w:rPr>
+          <w:rStyle w:val="ad"/>
+        </w:rPr>
+        <w:annotationRef/>
+      </w:r>
+      <w:r>
+        <w:rPr>
+          <w:rFonts w:hint="eastAsia"/>
+        </w:rPr>
+        <w:t>驱动对统计信息的解析，不要通过</w:t>
+      </w:r>
+      <w:r>
+        <w:rPr>
+          <w:rFonts w:hint="eastAsia"/>
+        </w:rPr>
+        <w:t xml:space="preserve"> </w:t>
+      </w:r>
+      <w:r>
+        <w:rPr>
+          <w:rFonts w:hint="eastAsia"/>
+        </w:rPr>
+        <w:t>在公共接口中拉回</w:t>
+      </w:r>
+      <w:r>
+        <w:rPr>
+          <w:rFonts w:hint="eastAsia"/>
+        </w:rPr>
+        <w:t xml:space="preserve"> withStat </w:t>
+      </w:r>
+      <w:r>
+        <w:rPr>
+          <w:rFonts w:hint="eastAsia"/>
+        </w:rPr>
+        <w:t>的方式，可由</w:t>
+      </w:r>
+    </w:p>
+  </w:comment>
+  <w:comment w:id="7" w:author="yangshangde" w:date="2018-12-22T13:53:00Z" w:initials="y">
+    <w:p>
+      <w:pPr>
+        <w:pStyle w:val="ae"/>
+      </w:pPr>
+      <w:r>
+        <w:rPr>
+          <w:rStyle w:val="ad"/>
+        </w:rPr>
+        <w:annotationRef/>
+      </w:r>
+      <w:r>
+        <w:t>getLast</w:t>
+      </w:r>
+      <w:r>
+        <w:t>Result</w:t>
+      </w:r>
+      <w:r>
+        <w:t>Obj</w:t>
+      </w:r>
+    </w:p>
+  </w:comment>
+  <w:comment w:id="8" w:author="yangshangde" w:date="2018-12-22T13:57:00Z" w:initials="y">
+    <w:p>
+      <w:pPr>
+        <w:pStyle w:val="ae"/>
+        <w:ind w:left="0"/>
+      </w:pPr>
+      <w:r>
+        <w:rPr>
+          <w:rStyle w:val="ad"/>
+        </w:rPr>
+        <w:annotationRef/>
+      </w:r>
+      <w:r>
+        <w:t xml:space="preserve">shell </w:t>
+      </w:r>
+      <w:r>
+        <w:rPr>
+          <w:rFonts w:hint="eastAsia"/>
+        </w:rPr>
+        <w:t>中给</w:t>
+      </w:r>
+      <w:r>
+        <w:rPr>
+          <w:rFonts w:hint="eastAsia"/>
+        </w:rPr>
+        <w:t xml:space="preserve"> insert/update/delete </w:t>
+      </w:r>
+      <w:r>
+        <w:rPr>
+          <w:rFonts w:hint="eastAsia"/>
+        </w:rPr>
+        <w:t>返回一个</w:t>
+      </w:r>
+      <w:r>
+        <w:rPr>
+          <w:rFonts w:hint="eastAsia"/>
+        </w:rPr>
+        <w:t xml:space="preserve"> BSON</w:t>
+      </w:r>
+      <w:r>
+        <w:rPr>
+          <w:rFonts w:hint="eastAsia"/>
+        </w:rPr>
+        <w:t>对象，不用额外调用接口，在</w:t>
+      </w:r>
+      <w:r>
+        <w:rPr>
+          <w:rFonts w:hint="eastAsia"/>
+        </w:rPr>
+        <w:t xml:space="preserve"> shell </w:t>
+      </w:r>
+      <w:r>
+        <w:rPr>
+          <w:rFonts w:hint="eastAsia"/>
+        </w:rPr>
+        <w:t>中直接显示</w:t>
+      </w:r>
+    </w:p>
+  </w:comment>
+  <w:comment w:id="9" w:author="yangshangde" w:date="2018-12-22T14:47:00Z" w:initials="y">
+    <w:p>
+      <w:pPr>
+        <w:pStyle w:val="ae"/>
+        <w:ind w:left="0"/>
+        <w:rPr>
+          <w:rFonts w:hint="eastAsia"/>
+        </w:rPr>
+      </w:pPr>
+      <w:r>
+        <w:rPr>
+          <w:rStyle w:val="ad"/>
+        </w:rPr>
+        <w:annotationRef/>
+      </w:r>
+      <w:r>
+        <w:rPr>
+          <w:rFonts w:hint="eastAsia"/>
+        </w:rPr>
+        <w:t>插入现有</w:t>
+      </w:r>
+      <w:r>
+        <w:rPr>
+          <w:rFonts w:hint="eastAsia"/>
+        </w:rPr>
+        <w:t xml:space="preserve">flag </w:t>
+      </w:r>
+      <w:r>
+        <w:rPr>
+          <w:rFonts w:hint="eastAsia"/>
+        </w:rPr>
+        <w:t>的结果需要与</w:t>
+      </w:r>
+      <w:r>
+        <w:rPr>
+          <w:rFonts w:hint="eastAsia"/>
+        </w:rPr>
+        <w:t xml:space="preserve"> write </w:t>
+      </w:r>
+      <w:r>
+        <w:rPr>
+          <w:rFonts w:hint="eastAsia"/>
+        </w:rPr>
+        <w:t>合并，在</w:t>
+      </w:r>
+      <w:r>
+        <w:rPr>
+          <w:rFonts w:hint="eastAsia"/>
+        </w:rPr>
+        <w:t xml:space="preserve"> js </w:t>
+      </w:r>
+      <w:r>
+        <w:rPr>
+          <w:rFonts w:hint="eastAsia"/>
+        </w:rPr>
+        <w:t>中处理。</w:t>
+      </w:r>
+    </w:p>
+  </w:comment>
+  <w:comment w:id="10" w:author="yangshangde" w:date="2018-12-22T14:55:00Z" w:initials="y">
+    <w:p>
+      <w:pPr>
+        <w:pStyle w:val="ae"/>
+      </w:pPr>
+      <w:r>
+        <w:rPr>
+          <w:rStyle w:val="ad"/>
+        </w:rPr>
+        <w:annotationRef/>
+      </w:r>
+      <w:r>
+        <w:rPr>
+          <w:rFonts w:hint="eastAsia"/>
+        </w:rPr>
+        <w:t>协调节点上</w:t>
+      </w:r>
+      <w:r>
+        <w:rPr>
+          <w:rFonts w:hint="eastAsia"/>
+        </w:rPr>
+        <w:t xml:space="preserve"> errNodes </w:t>
+      </w:r>
+      <w:r>
+        <w:rPr>
+          <w:rFonts w:hint="eastAsia"/>
+        </w:rPr>
+        <w:t>中可以保留原始的统计信息，保证消息结构上的一致</w:t>
+      </w:r>
+    </w:p>
+  </w:comment>
+  <w:comment w:id="11" w:author="yangshangde" w:date="2018-12-22T15:00:00Z" w:initials="y">
+    <w:p>
+      <w:pPr>
+        <w:pStyle w:val="ae"/>
+        <w:rPr>
+          <w:rFonts w:hint="eastAsia"/>
+        </w:rPr>
+      </w:pPr>
+      <w:r>
+        <w:rPr>
+          <w:rStyle w:val="ad"/>
+        </w:rPr>
+        <w:annotationRef/>
+      </w:r>
+      <w:r>
+        <w:rPr>
+          <w:rFonts w:hint="eastAsia"/>
+        </w:rPr>
+        <w:t>的</w:t>
+      </w:r>
+      <w:r>
+        <w:rPr>
+          <w:rFonts w:hint="eastAsia"/>
+        </w:rPr>
+        <w:t xml:space="preserve"> monApp</w:t>
+      </w:r>
+      <w:r>
+        <w:t xml:space="preserve">CB </w:t>
+      </w:r>
+      <w:r>
+        <w:rPr>
+          <w:rFonts w:hint="eastAsia"/>
+        </w:rPr>
+        <w:t>中增加新的成员，用现有的接口来进行统计，</w:t>
+      </w:r>
+      <w:r>
+        <w:rPr>
+          <w:rFonts w:hint="eastAsia"/>
+        </w:rPr>
+        <w:t xml:space="preserve">rtn </w:t>
+      </w:r>
+      <w:r>
+        <w:rPr>
+          <w:rFonts w:hint="eastAsia"/>
+        </w:rPr>
+        <w:t>层通过接口来获取统计值</w:t>
+      </w:r>
+      <w:bookmarkStart w:id="12" w:name="_GoBack"/>
+      <w:bookmarkEnd w:id="12"/>
+    </w:p>
+  </w:comment>
+</w:comments>
+</file>
+
+<file path=word/commentsExtended.xml><?xml version="1.0" encoding="utf-8"?>
+<w15:commentsEx xmlns:wpc="http://schemas.microsoft.com/office/word/2010/wordprocessingCanvas" xmlns:cx="http://schemas.microsoft.com/office/drawing/2014/chartex" xmlns:mc="http://schemas.openxmlformats.org/markup-compatibility/2006" xmlns:o="urn:schemas-microsoft-com:office:office" xmlns:r="http://schemas.openxmlformats.org/officeDocument/2006/relationships" xmlns:m="http://schemas.openxmlformats.org/officeDocument/2006/math" xmlns:v="urn:schemas-microsoft-com:vml" xmlns:wp14="http://schemas.microsoft.com/office/word/2010/wordprocessingDrawing" xmlns:wp="http://schemas.openxmlformats.org/drawingml/2006/wordprocessingDrawing" xmlns:w10="urn:schemas-microsoft-com:office:word" xmlns:w="http://schemas.openxmlformats.org/wordprocessingml/2006/main" xmlns:w14="http://schemas.microsoft.com/office/word/2010/wordml" xmlns:w15="http://schemas.microsoft.com/office/word/2012/wordml" xmlns:w16se="http://schemas.microsoft.com/office/word/2015/wordml/symex" xmlns:wpg="http://schemas.microsoft.com/office/word/2010/wordprocessingGroup" xmlns:wpi="http://schemas.microsoft.com/office/word/2010/wordprocessingInk" xmlns:wne="http://schemas.microsoft.com/office/word/2006/wordml" xmlns:wps="http://schemas.microsoft.com/office/word/2010/wordprocessingShape" mc:Ignorable="w14 w15 w16se wp14">
+  <w15:commentEx w15:paraId="53AB2ABA" w15:done="0"/>
+  <w15:commentEx w15:paraId="1541A554" w15:done="0"/>
+  <w15:commentEx w15:paraId="3F2D9F4A" w15:done="0"/>
+  <w15:commentEx w15:paraId="3169FEBC" w15:done="0"/>
+  <w15:commentEx w15:paraId="45B625E7" w15:done="0"/>
+  <w15:commentEx w15:paraId="4AAE5080" w15:done="0"/>
+  <w15:commentEx w15:paraId="37838E2D" w15:done="0"/>
+  <w15:commentEx w15:paraId="4B37AFB5" w15:done="0"/>
+  <w15:commentEx w15:paraId="6325E812" w15:done="0"/>
+  <w15:commentEx w15:paraId="27EB0139" w15:done="0"/>
+</w15:commentsEx>
 </file>
 
 <file path=word/endnotes.xml><?xml version="1.0" encoding="utf-8"?>
@@ -9570,6 +10105,14 @@
     <w:abstractNumId w:val="27"/>
   </w:num>
 </w:numbering>
+</file>
+
+<file path=word/people.xml><?xml version="1.0" encoding="utf-8"?>
+<w15:people xmlns:wpc="http://schemas.microsoft.com/office/word/2010/wordprocessingCanvas" xmlns:cx="http://schemas.microsoft.com/office/drawing/2014/chartex" xmlns:mc="http://schemas.openxmlformats.org/markup-compatibility/2006" xmlns:o="urn:schemas-microsoft-com:office:office" xmlns:r="http://schemas.openxmlformats.org/officeDocument/2006/relationships" xmlns:m="http://schemas.openxmlformats.org/officeDocument/2006/math" xmlns:v="urn:schemas-microsoft-com:vml" xmlns:wp14="http://schemas.microsoft.com/office/word/2010/wordprocessingDrawing" xmlns:wp="http://schemas.openxmlformats.org/drawingml/2006/wordprocessingDrawing" xmlns:w10="urn:schemas-microsoft-com:office:word" xmlns:w="http://schemas.openxmlformats.org/wordprocessingml/2006/main" xmlns:w14="http://schemas.microsoft.com/office/word/2010/wordml" xmlns:w15="http://schemas.microsoft.com/office/word/2012/wordml" xmlns:w16se="http://schemas.microsoft.com/office/word/2015/wordml/symex" xmlns:wpg="http://schemas.microsoft.com/office/word/2010/wordprocessingGroup" xmlns:wpi="http://schemas.microsoft.com/office/word/2010/wordprocessingInk" xmlns:wne="http://schemas.microsoft.com/office/word/2006/wordml" xmlns:wps="http://schemas.microsoft.com/office/word/2010/wordprocessingShape" mc:Ignorable="w14 w15 w16se wp14">
+  <w15:person w15:author="yangshangde">
+    <w15:presenceInfo w15:providerId="None" w15:userId="yangshangde"/>
+  </w15:person>
+</w15:people>
 </file>
 
 <file path=word/styles.xml><?xml version="1.0" encoding="utf-8"?>

</xml_diff>

<commit_message>
update story document: statistic information reply
git-svn-id: http://192.168.20.11/sequoiadb/trunk@38616 6121f079-4a18-41d3-8c30-8870a322f2c2
</commit_message>
<xml_diff>
--- a/internal_doc/03.开发设计/Story-操作统计信息查询.docx
+++ b/internal_doc/03.开发设计/Story-操作统计信息查询.docx
@@ -433,15 +433,15 @@
         <w:tblLook w:val="04A0" w:firstRow="1" w:lastRow="0" w:firstColumn="1" w:lastColumn="0" w:noHBand="0" w:noVBand="1"/>
       </w:tblPr>
       <w:tblGrid>
-        <w:gridCol w:w="2339"/>
-        <w:gridCol w:w="1257"/>
+        <w:gridCol w:w="2347"/>
+        <w:gridCol w:w="1246"/>
         <w:gridCol w:w="753"/>
-        <w:gridCol w:w="4173"/>
+        <w:gridCol w:w="4176"/>
       </w:tblGrid>
       <w:tr>
         <w:tc>
           <w:tcPr>
-            <w:tcW w:w="2361" w:type="dxa"/>
+            <w:tcW w:w="2339" w:type="dxa"/>
             <w:shd w:val="clear" w:color="auto" w:fill="D9D9D9" w:themeFill="background1" w:themeFillShade="D9"/>
           </w:tcPr>
           <w:p>
@@ -464,7 +464,7 @@
         </w:tc>
         <w:tc>
           <w:tcPr>
-            <w:tcW w:w="1133" w:type="dxa"/>
+            <w:tcW w:w="1257" w:type="dxa"/>
             <w:shd w:val="clear" w:color="auto" w:fill="D9D9D9" w:themeFill="background1" w:themeFillShade="D9"/>
           </w:tcPr>
           <w:p>
@@ -510,7 +510,7 @@
         </w:tc>
         <w:tc>
           <w:tcPr>
-            <w:tcW w:w="4275" w:type="dxa"/>
+            <w:tcW w:w="4173" w:type="dxa"/>
             <w:shd w:val="clear" w:color="auto" w:fill="D9D9D9" w:themeFill="background1" w:themeFillShade="D9"/>
           </w:tcPr>
           <w:p>
@@ -545,20 +545,13 @@
                 <w:szCs w:val="18"/>
               </w:rPr>
             </w:pPr>
-            <w:commentRangeStart w:id="2"/>
-            <w:r>
-              <w:rPr>
-                <w:sz w:val="18"/>
-                <w:szCs w:val="18"/>
-              </w:rPr>
-              <w:t>Statistic</w:t>
-            </w:r>
-            <w:commentRangeEnd w:id="2"/>
-            <w:r>
-              <w:rPr>
-                <w:rStyle w:val="ad"/>
-              </w:rPr>
-              <w:commentReference w:id="2"/>
+            <w:r>
+              <w:rPr>
+                <w:rFonts w:hint="eastAsia"/>
+                <w:sz w:val="18"/>
+                <w:szCs w:val="18"/>
+              </w:rPr>
+              <w:t>Write</w:t>
             </w:r>
           </w:p>
         </w:tc>
@@ -576,6 +569,7 @@
             </w:pPr>
             <w:r>
               <w:rPr>
+                <w:rFonts w:hint="eastAsia"/>
                 <w:sz w:val="18"/>
                 <w:szCs w:val="18"/>
               </w:rPr>
@@ -600,7 +594,7 @@
                 <w:sz w:val="18"/>
                 <w:szCs w:val="18"/>
               </w:rPr>
-              <w:t>是</w:t>
+              <w:t>否</w:t>
             </w:r>
           </w:p>
         </w:tc>
@@ -622,7 +616,39 @@
                 <w:sz w:val="18"/>
                 <w:szCs w:val="18"/>
               </w:rPr>
-              <w:t>操作统计信息，具体统计项随操作类型变化</w:t>
+              <w:t>写操作统计信息</w:t>
+            </w:r>
+            <w:r>
+              <w:rPr>
+                <w:rFonts w:hint="eastAsia"/>
+                <w:sz w:val="18"/>
+                <w:szCs w:val="18"/>
+              </w:rPr>
+              <w:t>，执行</w:t>
+            </w:r>
+            <w:r>
+              <w:rPr>
+                <w:rFonts w:hint="eastAsia"/>
+                <w:sz w:val="18"/>
+                <w:szCs w:val="18"/>
+              </w:rPr>
+              <w:t xml:space="preserve"> insert/update/delete </w:t>
+            </w:r>
+            <w:r>
+              <w:rPr>
+                <w:rFonts w:hint="eastAsia"/>
+                <w:sz w:val="18"/>
+                <w:szCs w:val="18"/>
+              </w:rPr>
+              <w:t>时，统计</w:t>
+            </w:r>
+            <w:r>
+              <w:rPr>
+                <w:rFonts w:hint="eastAsia"/>
+                <w:sz w:val="18"/>
+                <w:szCs w:val="18"/>
+              </w:rPr>
+              <w:t>中包含该内容</w:t>
             </w:r>
           </w:p>
         </w:tc>
@@ -630,7 +656,7 @@
       <w:tr>
         <w:tc>
           <w:tcPr>
-            <w:tcW w:w="2361" w:type="dxa"/>
+            <w:tcW w:w="2339" w:type="dxa"/>
             <w:shd w:val="clear" w:color="auto" w:fill="auto"/>
           </w:tcPr>
           <w:p>
@@ -646,13 +672,28 @@
                 <w:sz w:val="18"/>
                 <w:szCs w:val="18"/>
               </w:rPr>
-              <w:t>Write</w:t>
-            </w:r>
-          </w:p>
-        </w:tc>
-        <w:tc>
-          <w:tcPr>
-            <w:tcW w:w="1133" w:type="dxa"/>
+              <w:t>Write.I</w:t>
+            </w:r>
+            <w:r>
+              <w:rPr>
+                <w:rFonts w:hint="eastAsia"/>
+                <w:sz w:val="18"/>
+                <w:szCs w:val="18"/>
+              </w:rPr>
+              <w:t>nsert</w:t>
+            </w:r>
+            <w:r>
+              <w:rPr>
+                <w:sz w:val="18"/>
+                <w:szCs w:val="18"/>
+              </w:rPr>
+              <w:t>Count</w:t>
+            </w:r>
+          </w:p>
+        </w:tc>
+        <w:tc>
+          <w:tcPr>
+            <w:tcW w:w="1257" w:type="dxa"/>
             <w:shd w:val="clear" w:color="auto" w:fill="auto"/>
           </w:tcPr>
           <w:p>
@@ -668,7 +709,15 @@
                 <w:sz w:val="18"/>
                 <w:szCs w:val="18"/>
               </w:rPr>
-              <w:t>BSON</w:t>
+              <w:t>I</w:t>
+            </w:r>
+            <w:r>
+              <w:rPr>
+                <w:rFonts w:hint="eastAsia"/>
+                <w:sz w:val="18"/>
+                <w:szCs w:val="18"/>
+              </w:rPr>
+              <w:t>NT64</w:t>
             </w:r>
           </w:p>
         </w:tc>
@@ -689,13 +738,13 @@
                 <w:sz w:val="18"/>
                 <w:szCs w:val="18"/>
               </w:rPr>
-              <w:t>否</w:t>
-            </w:r>
-          </w:p>
-        </w:tc>
-        <w:tc>
-          <w:tcPr>
-            <w:tcW w:w="4275" w:type="dxa"/>
+              <w:t>是</w:t>
+            </w:r>
+          </w:p>
+        </w:tc>
+        <w:tc>
+          <w:tcPr>
+            <w:tcW w:w="4173" w:type="dxa"/>
             <w:shd w:val="clear" w:color="auto" w:fill="auto"/>
           </w:tcPr>
           <w:p>
@@ -711,55 +760,7 @@
                 <w:sz w:val="18"/>
                 <w:szCs w:val="18"/>
               </w:rPr>
-              <w:t xml:space="preserve">Statistic </w:t>
-            </w:r>
-            <w:r>
-              <w:rPr>
-                <w:rFonts w:hint="eastAsia"/>
-                <w:sz w:val="18"/>
-                <w:szCs w:val="18"/>
-              </w:rPr>
-              <w:t>子对象，</w:t>
-            </w:r>
-            <w:r>
-              <w:rPr>
-                <w:rFonts w:hint="eastAsia"/>
-                <w:sz w:val="18"/>
-                <w:szCs w:val="18"/>
-              </w:rPr>
-              <w:t>写操作统计信息</w:t>
-            </w:r>
-            <w:r>
-              <w:rPr>
-                <w:rFonts w:hint="eastAsia"/>
-                <w:sz w:val="18"/>
-                <w:szCs w:val="18"/>
-              </w:rPr>
-              <w:t>，执行</w:t>
-            </w:r>
-            <w:r>
-              <w:rPr>
-                <w:rFonts w:hint="eastAsia"/>
-                <w:sz w:val="18"/>
-                <w:szCs w:val="18"/>
-              </w:rPr>
-              <w:t xml:space="preserve"> insert/update/delete </w:t>
-            </w:r>
-            <w:r>
-              <w:rPr>
-                <w:rFonts w:hint="eastAsia"/>
-                <w:sz w:val="18"/>
-                <w:szCs w:val="18"/>
-              </w:rPr>
-              <w:t>时，统计</w:t>
-            </w:r>
-            <w:r>
-              <w:rPr>
-                <w:rFonts w:hint="eastAsia"/>
-                <w:sz w:val="18"/>
-                <w:szCs w:val="18"/>
-              </w:rPr>
-              <w:t>中包含该内容</w:t>
+              <w:t>插入成功的记录数</w:t>
             </w:r>
           </w:p>
         </w:tc>
@@ -767,7 +768,7 @@
       <w:tr>
         <w:tc>
           <w:tcPr>
-            <w:tcW w:w="2361" w:type="dxa"/>
+            <w:tcW w:w="2339" w:type="dxa"/>
             <w:shd w:val="clear" w:color="auto" w:fill="auto"/>
           </w:tcPr>
           <w:p>
@@ -779,41 +780,16 @@
             </w:pPr>
             <w:r>
               <w:rPr>
-                <w:rFonts w:hint="eastAsia"/>
-                <w:sz w:val="18"/>
-                <w:szCs w:val="18"/>
-              </w:rPr>
-              <w:t>Write.</w:t>
-            </w:r>
-            <w:commentRangeStart w:id="3"/>
-            <w:r>
-              <w:rPr>
-                <w:rFonts w:hint="eastAsia"/>
-                <w:sz w:val="18"/>
-                <w:szCs w:val="18"/>
-              </w:rPr>
-              <w:t>I</w:t>
-            </w:r>
-            <w:r>
-              <w:rPr>
-                <w:rFonts w:hint="eastAsia"/>
-                <w:sz w:val="18"/>
-                <w:szCs w:val="18"/>
-              </w:rPr>
-              <w:t>nserted</w:t>
-            </w:r>
-            <w:commentRangeEnd w:id="3"/>
-            <w:r>
-              <w:rPr>
-                <w:rStyle w:val="ad"/>
-              </w:rPr>
-              <w:commentReference w:id="3"/>
-            </w:r>
-          </w:p>
-        </w:tc>
-        <w:tc>
-          <w:tcPr>
-            <w:tcW w:w="1133" w:type="dxa"/>
+                <w:sz w:val="18"/>
+                <w:szCs w:val="18"/>
+              </w:rPr>
+              <w:t>Write.IgnoreCount</w:t>
+            </w:r>
+          </w:p>
+        </w:tc>
+        <w:tc>
+          <w:tcPr>
+            <w:tcW w:w="1257" w:type="dxa"/>
             <w:shd w:val="clear" w:color="auto" w:fill="auto"/>
           </w:tcPr>
           <w:p>
@@ -825,11 +801,10 @@
             </w:pPr>
             <w:r>
               <w:rPr>
-                <w:rFonts w:hint="eastAsia"/>
-                <w:sz w:val="18"/>
-                <w:szCs w:val="18"/>
-              </w:rPr>
-              <w:t>INT32</w:t>
+                <w:sz w:val="18"/>
+                <w:szCs w:val="18"/>
+              </w:rPr>
+              <w:t>INT64</w:t>
             </w:r>
           </w:p>
         </w:tc>
@@ -856,7 +831,7 @@
         </w:tc>
         <w:tc>
           <w:tcPr>
-            <w:tcW w:w="4275" w:type="dxa"/>
+            <w:tcW w:w="4173" w:type="dxa"/>
             <w:shd w:val="clear" w:color="auto" w:fill="auto"/>
           </w:tcPr>
           <w:p>
@@ -872,7 +847,7 @@
                 <w:sz w:val="18"/>
                 <w:szCs w:val="18"/>
               </w:rPr>
-              <w:t>插入成功的记录数</w:t>
+              <w:t>忽略的记录数</w:t>
             </w:r>
           </w:p>
         </w:tc>
@@ -880,7 +855,7 @@
       <w:tr>
         <w:tc>
           <w:tcPr>
-            <w:tcW w:w="2361" w:type="dxa"/>
+            <w:tcW w:w="2339" w:type="dxa"/>
             <w:shd w:val="clear" w:color="auto" w:fill="auto"/>
           </w:tcPr>
           <w:p>
@@ -904,13 +879,13 @@
                 <w:sz w:val="18"/>
                 <w:szCs w:val="18"/>
               </w:rPr>
-              <w:t>Matched</w:t>
-            </w:r>
-          </w:p>
-        </w:tc>
-        <w:tc>
-          <w:tcPr>
-            <w:tcW w:w="1133" w:type="dxa"/>
+              <w:t>MatchCount</w:t>
+            </w:r>
+          </w:p>
+        </w:tc>
+        <w:tc>
+          <w:tcPr>
+            <w:tcW w:w="1257" w:type="dxa"/>
             <w:shd w:val="clear" w:color="auto" w:fill="auto"/>
           </w:tcPr>
           <w:p>
@@ -926,7 +901,7 @@
                 <w:sz w:val="18"/>
                 <w:szCs w:val="18"/>
               </w:rPr>
-              <w:t>INT32</w:t>
+              <w:t>INT64</w:t>
             </w:r>
           </w:p>
         </w:tc>
@@ -953,7 +928,7 @@
         </w:tc>
         <w:tc>
           <w:tcPr>
-            <w:tcW w:w="4275" w:type="dxa"/>
+            <w:tcW w:w="4173" w:type="dxa"/>
             <w:shd w:val="clear" w:color="auto" w:fill="auto"/>
           </w:tcPr>
           <w:p>
@@ -1038,11 +1013,18 @@
             </w:r>
             <w:r>
               <w:rPr>
-                <w:rFonts w:hint="eastAsia"/>
-                <w:sz w:val="18"/>
-                <w:szCs w:val="18"/>
-              </w:rPr>
-              <w:t xml:space="preserve">nModified </w:t>
+                <w:sz w:val="18"/>
+                <w:szCs w:val="18"/>
+              </w:rPr>
+              <w:t xml:space="preserve"> updateCount</w:t>
+            </w:r>
+            <w:r>
+              <w:rPr>
+                <w:rFonts w:hint="eastAsia"/>
+                <w:sz w:val="18"/>
+                <w:szCs w:val="18"/>
+              </w:rPr>
+              <w:t xml:space="preserve"> </w:t>
             </w:r>
             <w:r>
               <w:rPr>
@@ -1058,7 +1040,7 @@
       <w:tr>
         <w:tc>
           <w:tcPr>
-            <w:tcW w:w="2361" w:type="dxa"/>
+            <w:tcW w:w="2339" w:type="dxa"/>
             <w:shd w:val="clear" w:color="auto" w:fill="auto"/>
           </w:tcPr>
           <w:p>
@@ -1074,13 +1056,13 @@
                 <w:sz w:val="18"/>
                 <w:szCs w:val="18"/>
               </w:rPr>
-              <w:t>Write.nModified</w:t>
-            </w:r>
-          </w:p>
-        </w:tc>
-        <w:tc>
-          <w:tcPr>
-            <w:tcW w:w="1133" w:type="dxa"/>
+              <w:t>Write.ModifyCount</w:t>
+            </w:r>
+          </w:p>
+        </w:tc>
+        <w:tc>
+          <w:tcPr>
+            <w:tcW w:w="1257" w:type="dxa"/>
             <w:shd w:val="clear" w:color="auto" w:fill="auto"/>
           </w:tcPr>
           <w:p>
@@ -1096,7 +1078,7 @@
                 <w:sz w:val="18"/>
                 <w:szCs w:val="18"/>
               </w:rPr>
-              <w:t>INT32</w:t>
+              <w:t>INT64</w:t>
             </w:r>
           </w:p>
         </w:tc>
@@ -1123,7 +1105,7 @@
         </w:tc>
         <w:tc>
           <w:tcPr>
-            <w:tcW w:w="4275" w:type="dxa"/>
+            <w:tcW w:w="4173" w:type="dxa"/>
             <w:shd w:val="clear" w:color="auto" w:fill="auto"/>
           </w:tcPr>
           <w:p>
@@ -1171,7 +1153,7 @@
       <w:tr>
         <w:tc>
           <w:tcPr>
-            <w:tcW w:w="2361" w:type="dxa"/>
+            <w:tcW w:w="2339" w:type="dxa"/>
             <w:tcBorders>
               <w:bottom w:val="single" w:sz="4" w:space="0" w:color="000000" w:themeColor="text1"/>
             </w:tcBorders>
@@ -1191,13 +1173,13 @@
                 <w:szCs w:val="18"/>
               </w:rPr>
               <w:lastRenderedPageBreak/>
-              <w:t>Write.nRemoved</w:t>
-            </w:r>
-          </w:p>
-        </w:tc>
-        <w:tc>
-          <w:tcPr>
-            <w:tcW w:w="1133" w:type="dxa"/>
+              <w:t>Write.RemoveCount</w:t>
+            </w:r>
+          </w:p>
+        </w:tc>
+        <w:tc>
+          <w:tcPr>
+            <w:tcW w:w="1257" w:type="dxa"/>
             <w:tcBorders>
               <w:bottom w:val="single" w:sz="4" w:space="0" w:color="000000" w:themeColor="text1"/>
             </w:tcBorders>
@@ -1210,21 +1192,21 @@
                 <w:szCs w:val="18"/>
               </w:rPr>
             </w:pPr>
-            <w:commentRangeStart w:id="4"/>
-            <w:r>
-              <w:rPr>
-                <w:rFonts w:hint="eastAsia"/>
-                <w:sz w:val="18"/>
-                <w:szCs w:val="18"/>
-              </w:rPr>
-              <w:t>INT32</w:t>
-            </w:r>
-            <w:commentRangeEnd w:id="4"/>
-            <w:r>
-              <w:rPr>
-                <w:rStyle w:val="ad"/>
-              </w:rPr>
-              <w:commentReference w:id="4"/>
+            <w:r>
+              <w:rPr>
+                <w:rFonts w:hint="eastAsia"/>
+                <w:sz w:val="18"/>
+                <w:szCs w:val="18"/>
+              </w:rPr>
+              <w:t>INT</w:t>
+            </w:r>
+            <w:r>
+              <w:rPr>
+                <w:rFonts w:hint="eastAsia"/>
+                <w:sz w:val="18"/>
+                <w:szCs w:val="18"/>
+              </w:rPr>
+              <w:t>64</w:t>
             </w:r>
           </w:p>
         </w:tc>
@@ -1254,7 +1236,7 @@
         </w:tc>
         <w:tc>
           <w:tcPr>
-            <w:tcW w:w="4275" w:type="dxa"/>
+            <w:tcW w:w="4173" w:type="dxa"/>
             <w:tcBorders>
               <w:bottom w:val="single" w:sz="4" w:space="0" w:color="000000" w:themeColor="text1"/>
             </w:tcBorders>
@@ -1322,42 +1304,43 @@
         <w:t>nsert</w:t>
       </w:r>
       <w:r>
+        <w:t>/bulk insert</w:t>
+      </w:r>
+      <w:r>
         <w:rPr>
           <w:rFonts w:hint="eastAsia"/>
         </w:rPr>
         <w:t>：</w:t>
       </w:r>
-      <w:commentRangeStart w:id="5"/>
-      <w:r>
-        <w:rPr>
-          <w:rFonts w:hint="eastAsia"/>
-        </w:rPr>
-        <w:t>只更改</w:t>
-      </w:r>
-      <w:r>
-        <w:rPr>
-          <w:rFonts w:hint="eastAsia"/>
-        </w:rPr>
-        <w:t xml:space="preserve"> nInserted </w:t>
-      </w:r>
-      <w:r>
-        <w:rPr>
-          <w:rFonts w:hint="eastAsia"/>
-        </w:rPr>
-        <w:t>的值，其</w:t>
-      </w:r>
-      <w:commentRangeEnd w:id="5"/>
-      <w:r>
-        <w:rPr>
-          <w:rStyle w:val="ad"/>
-        </w:rPr>
-        <w:commentReference w:id="5"/>
-      </w:r>
-      <w:r>
-        <w:rPr>
-          <w:rFonts w:hint="eastAsia"/>
-        </w:rPr>
-        <w:t>值为成功插入的记录数</w:t>
+      <w:r>
+        <w:rPr>
+          <w:rFonts w:hint="eastAsia"/>
+        </w:rPr>
+        <w:t>更改</w:t>
+      </w:r>
+      <w:r>
+        <w:rPr>
+          <w:rFonts w:hint="eastAsia"/>
+        </w:rPr>
+        <w:t xml:space="preserve"> InsertCount </w:t>
+      </w:r>
+      <w:r>
+        <w:rPr>
+          <w:rFonts w:hint="eastAsia"/>
+        </w:rPr>
+        <w:t>及</w:t>
+      </w:r>
+      <w:r>
+        <w:rPr>
+          <w:rFonts w:hint="eastAsia"/>
+        </w:rPr>
+        <w:t xml:space="preserve"> IgnoreCount </w:t>
+      </w:r>
+      <w:r>
+        <w:rPr>
+          <w:rFonts w:hint="eastAsia"/>
+        </w:rPr>
+        <w:t>的值</w:t>
       </w:r>
     </w:p>
     <w:p>
@@ -1370,25 +1353,49 @@
         <w:ind w:firstLineChars="0"/>
       </w:pPr>
       <w:r>
-        <w:t>bulk insert</w:t>
-      </w:r>
-      <w:r>
-        <w:rPr>
-          <w:rFonts w:hint="eastAsia"/>
-        </w:rPr>
-        <w:t>：只更改</w:t>
-      </w:r>
-      <w:r>
-        <w:rPr>
-          <w:rFonts w:hint="eastAsia"/>
-        </w:rPr>
-        <w:t xml:space="preserve"> nInserted </w:t>
-      </w:r>
-      <w:r>
-        <w:rPr>
-          <w:rFonts w:hint="eastAsia"/>
-        </w:rPr>
-        <w:t>的值，其值为成功插入的记录数</w:t>
+        <w:t>update</w:t>
+      </w:r>
+      <w:r>
+        <w:rPr>
+          <w:rFonts w:hint="eastAsia"/>
+        </w:rPr>
+        <w:t>：更改</w:t>
+      </w:r>
+      <w:r>
+        <w:t xml:space="preserve"> MatchCount</w:t>
+      </w:r>
+      <w:r>
+        <w:rPr>
+          <w:rFonts w:hint="eastAsia"/>
+        </w:rPr>
+        <w:t>，</w:t>
+      </w:r>
+      <w:r>
+        <w:rPr>
+          <w:rFonts w:hint="eastAsia"/>
+        </w:rPr>
+        <w:t>Modify</w:t>
+      </w:r>
+      <w:r>
+        <w:t>Count</w:t>
+      </w:r>
+      <w:r>
+        <w:rPr>
+          <w:rFonts w:hint="eastAsia"/>
+        </w:rPr>
+        <w:t xml:space="preserve"> </w:t>
+      </w:r>
+      <w:r>
+        <w:rPr>
+          <w:rFonts w:hint="eastAsia"/>
+        </w:rPr>
+        <w:t>两个字段</w:t>
+      </w:r>
+      <w:r>
+        <w:rPr>
+          <w:rFonts w:hint="eastAsia"/>
+        </w:rPr>
+        <w:t>，正常情况下其值均等于被更新的记录数</w:t>
       </w:r>
     </w:p>
     <w:p>
@@ -1401,7 +1408,7 @@
         <w:ind w:firstLineChars="0"/>
       </w:pPr>
       <w:r>
-        <w:t>update</w:t>
+        <w:t>upsert</w:t>
       </w:r>
       <w:r>
         <w:rPr>
@@ -1416,13 +1423,13 @@
         <w:t xml:space="preserve"> </w:t>
       </w:r>
       <w:r>
-        <w:t>n</w:t>
-      </w:r>
-      <w:r>
-        <w:rPr>
-          <w:rFonts w:hint="eastAsia"/>
-        </w:rPr>
-        <w:t>Matched</w:t>
+        <w:rPr>
+          <w:rFonts w:hint="eastAsia"/>
+        </w:rPr>
+        <w:t>Ma</w:t>
+      </w:r>
+      <w:r>
+        <w:t>tchCount</w:t>
       </w:r>
       <w:r>
         <w:rPr>
@@ -1431,22 +1438,28 @@
         <w:t>，</w:t>
       </w:r>
       <w:r>
-        <w:rPr>
-          <w:rFonts w:hint="eastAsia"/>
-        </w:rPr>
-        <w:t xml:space="preserve">nModified </w:t>
-      </w:r>
-      <w:r>
-        <w:rPr>
-          <w:rFonts w:hint="eastAsia"/>
-        </w:rPr>
-        <w:t>两个字段</w:t>
-      </w:r>
-      <w:r>
-        <w:rPr>
-          <w:rFonts w:hint="eastAsia"/>
-        </w:rPr>
-        <w:t>，正常情况下其值均等于被更新的记录数</w:t>
+        <w:t>ModifyCount</w:t>
+      </w:r>
+      <w:r>
+        <w:rPr>
+          <w:rFonts w:hint="eastAsia"/>
+        </w:rPr>
+        <w:t>，</w:t>
+      </w:r>
+      <w:r>
+        <w:t xml:space="preserve">InsertCount </w:t>
+      </w:r>
+      <w:r>
+        <w:rPr>
+          <w:rFonts w:hint="eastAsia"/>
+        </w:rPr>
+        <w:t>三个字段</w:t>
+      </w:r>
+      <w:r>
+        <w:rPr>
+          <w:rFonts w:hint="eastAsia"/>
+        </w:rPr>
+        <w:t>，正常情况下，其值应分别等待更新或插入的记录数，或其总数</w:t>
       </w:r>
     </w:p>
     <w:p>
@@ -1459,129 +1472,86 @@
         <w:ind w:firstLineChars="0"/>
       </w:pPr>
       <w:r>
-        <w:t>upsert</w:t>
-      </w:r>
-      <w:r>
-        <w:rPr>
-          <w:rFonts w:hint="eastAsia"/>
-        </w:rPr>
-        <w:t>：更改</w:t>
-      </w:r>
-      <w:r>
-        <w:rPr>
-          <w:rFonts w:hint="eastAsia"/>
-        </w:rPr>
-        <w:t xml:space="preserve"> </w:t>
-      </w:r>
-      <w:r>
-        <w:t>n</w:t>
-      </w:r>
-      <w:r>
-        <w:rPr>
-          <w:rFonts w:hint="eastAsia"/>
-        </w:rPr>
-        <w:t>Matched</w:t>
-      </w:r>
-      <w:r>
-        <w:rPr>
-          <w:rFonts w:hint="eastAsia"/>
-        </w:rPr>
-        <w:t>，</w:t>
-      </w:r>
-      <w:r>
-        <w:rPr>
-          <w:rFonts w:hint="eastAsia"/>
-        </w:rPr>
-        <w:t>nModified</w:t>
-      </w:r>
-      <w:r>
-        <w:rPr>
-          <w:rFonts w:hint="eastAsia"/>
-        </w:rPr>
-        <w:t>，</w:t>
-      </w:r>
-      <w:r>
-        <w:rPr>
-          <w:rFonts w:hint="eastAsia"/>
-        </w:rPr>
-        <w:t xml:space="preserve">nInserted </w:t>
-      </w:r>
-      <w:r>
-        <w:rPr>
-          <w:rFonts w:hint="eastAsia"/>
-        </w:rPr>
-        <w:t>三个字段</w:t>
-      </w:r>
-      <w:r>
-        <w:rPr>
-          <w:rFonts w:hint="eastAsia"/>
-        </w:rPr>
-        <w:t>，正常情况下，其值应分别等待更新或插入的记录数，或其总数</w:t>
+        <w:t>delete</w:t>
+      </w:r>
+      <w:r>
+        <w:rPr>
+          <w:rFonts w:hint="eastAsia"/>
+        </w:rPr>
+        <w:t>：更新</w:t>
+      </w:r>
+      <w:r>
+        <w:t xml:space="preserve"> RemoveCount</w:t>
+      </w:r>
+      <w:r>
+        <w:rPr>
+          <w:rFonts w:hint="eastAsia"/>
+        </w:rPr>
+        <w:t>，其值等于实际被删除的记录数</w:t>
       </w:r>
     </w:p>
     <w:p>
       <w:pPr>
-        <w:pStyle w:val="aa"/>
-        <w:numPr>
-          <w:ilvl w:val="0"/>
-          <w:numId w:val="18"/>
-        </w:numPr>
-        <w:ind w:firstLineChars="0"/>
-      </w:pPr>
-      <w:r>
-        <w:t>delete</w:t>
-      </w:r>
-      <w:r>
-        <w:rPr>
-          <w:rFonts w:hint="eastAsia"/>
-        </w:rPr>
-        <w:t>：更新</w:t>
-      </w:r>
-      <w:r>
-        <w:rPr>
-          <w:rFonts w:hint="eastAsia"/>
-        </w:rPr>
-        <w:t>nRemoved</w:t>
-      </w:r>
-      <w:r>
-        <w:rPr>
-          <w:rFonts w:hint="eastAsia"/>
-        </w:rPr>
-        <w:t>，其值等于实际被删除的记录数</w:t>
+        <w:pStyle w:val="3"/>
+        <w:ind w:left="357"/>
+      </w:pPr>
+      <w:r>
+        <w:rPr>
+          <w:rFonts w:hint="eastAsia"/>
+        </w:rPr>
+        <w:t>接口变更</w:t>
       </w:r>
     </w:p>
     <w:p>
       <w:pPr>
-        <w:pStyle w:val="3"/>
-        <w:ind w:left="357"/>
-      </w:pPr>
-      <w:r>
-        <w:rPr>
-          <w:rFonts w:hint="eastAsia"/>
-        </w:rPr>
-        <w:t>接口变更</w:t>
+        <w:pStyle w:val="4"/>
+      </w:pPr>
+      <w:r>
+        <w:rPr>
+          <w:rFonts w:hint="eastAsia"/>
+        </w:rPr>
+        <w:t>驱动接口变更</w:t>
       </w:r>
     </w:p>
     <w:p>
       <w:pPr>
-        <w:pStyle w:val="4"/>
-      </w:pPr>
-      <w:commentRangeStart w:id="6"/>
-      <w:r>
-        <w:rPr>
-          <w:rFonts w:hint="eastAsia"/>
-        </w:rPr>
-        <w:t>驱动接口变更</w:t>
-      </w:r>
-      <w:commentRangeEnd w:id="6"/>
-      <w:r>
-        <w:rPr>
-          <w:rStyle w:val="ad"/>
-          <w:rFonts w:asciiTheme="minorHAnsi" w:eastAsiaTheme="minorEastAsia" w:hAnsiTheme="minorHAnsi" w:cstheme="minorBidi"/>
-          <w:b w:val="0"/>
-          <w:bCs w:val="0"/>
-        </w:rPr>
-        <w:commentReference w:id="6"/>
+        <w:ind w:left="420"/>
+      </w:pPr>
+      <w:r>
+        <w:rPr>
+          <w:rFonts w:hint="eastAsia"/>
+        </w:rPr>
+        <w:t>驱动提供接口</w:t>
+      </w:r>
+      <w:r>
+        <w:t>getLastResultObj</w:t>
+      </w:r>
+      <w:r>
+        <w:rPr>
+          <w:rFonts w:hint="eastAsia"/>
+        </w:rPr>
+        <w:t xml:space="preserve"> </w:t>
+      </w:r>
+      <w:r>
+        <w:rPr>
+          <w:rFonts w:hint="eastAsia"/>
+        </w:rPr>
+        <w:t>供用户获取统计信息，调用成功时，统计信息对象被拷贝到出参</w:t>
+      </w:r>
+      <w:r>
+        <w:rPr>
+          <w:rFonts w:hint="eastAsia"/>
+        </w:rPr>
+        <w:t xml:space="preserve"> </w:t>
+      </w:r>
+      <w:r>
+        <w:t>resultObj</w:t>
+      </w:r>
+      <w:r>
+        <w:rPr>
+          <w:rFonts w:hint="eastAsia"/>
+        </w:rPr>
+        <w:t>中。</w:t>
       </w:r>
     </w:p>
     <w:p>
@@ -1592,39 +1562,16 @@
         <w:rPr>
           <w:rFonts w:hint="eastAsia"/>
         </w:rPr>
-        <w:t>驱动提供接口</w:t>
-      </w:r>
-      <w:commentRangeStart w:id="7"/>
-      <w:r>
-        <w:rPr>
-          <w:rFonts w:hint="eastAsia"/>
-        </w:rPr>
-        <w:t xml:space="preserve">getLastStatistic </w:t>
-      </w:r>
-      <w:commentRangeEnd w:id="7"/>
-      <w:r>
-        <w:rPr>
-          <w:rStyle w:val="ad"/>
-        </w:rPr>
-        <w:commentReference w:id="7"/>
-      </w:r>
-      <w:r>
-        <w:rPr>
-          <w:rFonts w:hint="eastAsia"/>
-        </w:rPr>
-        <w:t>供用户获取统计信息，调用成功时，统计信息对象被拷贝到出参</w:t>
-      </w:r>
-      <w:r>
-        <w:rPr>
-          <w:rFonts w:hint="eastAsia"/>
-        </w:rPr>
-        <w:t xml:space="preserve"> statObj </w:t>
-      </w:r>
-      <w:r>
-        <w:rPr>
-          <w:rFonts w:hint="eastAsia"/>
-        </w:rPr>
-        <w:t>中。</w:t>
+        <w:t>C</w:t>
+      </w:r>
+      <w:r>
+        <w:t xml:space="preserve"> </w:t>
+      </w:r>
+      <w:r>
+        <w:rPr>
+          <w:rFonts w:hint="eastAsia"/>
+        </w:rPr>
+        <w:t>驱动</w:t>
       </w:r>
     </w:p>
     <w:p>
@@ -1635,130 +1582,153 @@
         <w:rPr>
           <w:rFonts w:hint="eastAsia"/>
         </w:rPr>
-        <w:t>C</w:t>
+        <w:t>INT32 sdbGet</w:t>
+      </w:r>
+      <w:r>
+        <w:t>Last</w:t>
+      </w:r>
+      <w:r>
+        <w:t xml:space="preserve">ResultObj </w:t>
+      </w:r>
+      <w:r>
+        <w:t>(</w:t>
+      </w:r>
+      <w:r>
+        <w:t xml:space="preserve"> sdbConnectionHandle cHandle, bson *</w:t>
+      </w:r>
+      <w:r>
+        <w:t>resultObj</w:t>
       </w:r>
       <w:r>
         <w:t xml:space="preserve"> </w:t>
       </w:r>
       <w:r>
-        <w:rPr>
-          <w:rFonts w:hint="eastAsia"/>
-        </w:rPr>
-        <w:t>驱动</w:t>
+        <w:t>) ;</w:t>
       </w:r>
     </w:p>
     <w:p>
       <w:pPr>
         <w:ind w:left="420"/>
       </w:pPr>
-      <w:r>
-        <w:rPr>
-          <w:rFonts w:hint="eastAsia"/>
-        </w:rPr>
-        <w:t>INT32 sdbGet</w:t>
-      </w:r>
-      <w:r>
-        <w:t>LastStat</w:t>
-      </w:r>
-      <w:r>
-        <w:t>istic(</w:t>
-      </w:r>
-      <w:r>
-        <w:t xml:space="preserve"> sdbConnectionHandle cHandle, bson *statObj </w:t>
-      </w:r>
-      <w:r>
-        <w:t>) ;</w:t>
-      </w:r>
     </w:p>
     <w:p>
       <w:pPr>
         <w:ind w:left="420"/>
       </w:pPr>
+      <w:r>
+        <w:t xml:space="preserve">C++ </w:t>
+      </w:r>
+      <w:r>
+        <w:rPr>
+          <w:rFonts w:hint="eastAsia"/>
+        </w:rPr>
+        <w:t>驱动</w:t>
+      </w:r>
     </w:p>
     <w:p>
       <w:pPr>
         <w:ind w:left="420"/>
       </w:pPr>
       <w:r>
-        <w:t xml:space="preserve">C++ </w:t>
-      </w:r>
-      <w:r>
-        <w:rPr>
-          <w:rFonts w:hint="eastAsia"/>
-        </w:rPr>
-        <w:t>驱动</w:t>
+        <w:t>virtual INT32 getLast</w:t>
+      </w:r>
+      <w:r>
+        <w:t>ResultObj</w:t>
+      </w:r>
+      <w:r>
+        <w:t>( bson::BSONObj &amp;</w:t>
+      </w:r>
+      <w:r>
+        <w:t xml:space="preserve"> </w:t>
+      </w:r>
+      <w:r>
+        <w:t>resultObj</w:t>
+      </w:r>
+      <w:r>
+        <w:t>) = 0 ;</w:t>
       </w:r>
     </w:p>
     <w:p>
       <w:pPr>
         <w:ind w:left="420"/>
       </w:pPr>
-      <w:r>
-        <w:t>virtual INT32 getLastStatistic( bson::BSONObj &amp;statObj ) = 0 ;</w:t>
-      </w:r>
     </w:p>
     <w:p>
       <w:pPr>
         <w:ind w:left="420"/>
       </w:pPr>
+      <w:r>
+        <w:rPr>
+          <w:rFonts w:hint="eastAsia"/>
+        </w:rPr>
+        <w:t>其它驱动均添加类似接口。</w:t>
+      </w:r>
     </w:p>
     <w:p>
       <w:pPr>
-        <w:ind w:left="420"/>
-      </w:pPr>
-      <w:r>
-        <w:rPr>
-          <w:rFonts w:hint="eastAsia"/>
-        </w:rPr>
-        <w:t>其它驱动均添加类似接口。</w:t>
+        <w:pStyle w:val="4"/>
+      </w:pPr>
+      <w:r>
+        <w:tab/>
+      </w:r>
+      <w:r>
+        <w:t>s</w:t>
+      </w:r>
+      <w:r>
+        <w:rPr>
+          <w:rFonts w:hint="eastAsia"/>
+        </w:rPr>
+        <w:t>db</w:t>
+      </w:r>
+      <w:r>
+        <w:t xml:space="preserve"> shell </w:t>
+      </w:r>
+      <w:r>
+        <w:rPr>
+          <w:rFonts w:hint="eastAsia"/>
+        </w:rPr>
+        <w:t>变更</w:t>
       </w:r>
     </w:p>
     <w:p>
       <w:pPr>
-        <w:pStyle w:val="4"/>
-      </w:pPr>
-      <w:r>
-        <w:tab/>
-      </w:r>
-      <w:commentRangeStart w:id="8"/>
-      <w:commentRangeStart w:id="9"/>
-      <w:r>
-        <w:t>s</w:t>
-      </w:r>
-      <w:r>
-        <w:rPr>
-          <w:rFonts w:hint="eastAsia"/>
-        </w:rPr>
-        <w:t>db</w:t>
-      </w:r>
-      <w:r>
-        <w:t xml:space="preserve"> shell </w:t>
-      </w:r>
-      <w:r>
-        <w:rPr>
-          <w:rFonts w:hint="eastAsia"/>
-        </w:rPr>
-        <w:t>变更</w:t>
-      </w:r>
-      <w:commentRangeEnd w:id="8"/>
-      <w:r>
-        <w:rPr>
-          <w:rStyle w:val="ad"/>
-          <w:rFonts w:asciiTheme="minorHAnsi" w:eastAsiaTheme="minorEastAsia" w:hAnsiTheme="minorHAnsi" w:cstheme="minorBidi"/>
-          <w:b w:val="0"/>
-          <w:bCs w:val="0"/>
-        </w:rPr>
-        <w:commentReference w:id="8"/>
-      </w:r>
-      <w:commentRangeEnd w:id="9"/>
-      <w:r>
-        <w:rPr>
-          <w:rStyle w:val="ad"/>
-          <w:rFonts w:asciiTheme="minorHAnsi" w:eastAsiaTheme="minorEastAsia" w:hAnsiTheme="minorHAnsi" w:cstheme="minorBidi"/>
-          <w:b w:val="0"/>
-          <w:bCs w:val="0"/>
-        </w:rPr>
-        <w:commentReference w:id="9"/>
+        <w:ind w:left="420"/>
+      </w:pPr>
+      <w:r>
+        <w:t xml:space="preserve">shell </w:t>
+      </w:r>
+      <w:r>
+        <w:rPr>
+          <w:rFonts w:hint="eastAsia"/>
+        </w:rPr>
+        <w:t>中</w:t>
+      </w:r>
+      <w:r>
+        <w:rPr>
+          <w:rFonts w:hint="eastAsia"/>
+        </w:rPr>
+        <w:t>，</w:t>
+      </w:r>
+      <w:r>
+        <w:rPr>
+          <w:rFonts w:hint="eastAsia"/>
+        </w:rPr>
+        <w:t>在</w:t>
+      </w:r>
+      <w:r>
+        <w:rPr>
+          <w:rFonts w:hint="eastAsia"/>
+        </w:rPr>
+        <w:t xml:space="preserve"> insert/update/delete/</w:t>
+      </w:r>
+      <w:r>
+        <w:t xml:space="preserve">upsert </w:t>
+      </w:r>
+      <w:r>
+        <w:rPr>
+          <w:rFonts w:hint="eastAsia"/>
+        </w:rPr>
+        <w:t>操作时返回统计信息。</w:t>
       </w:r>
     </w:p>
     <w:p>
@@ -1766,158 +1736,34 @@
         <w:ind w:left="420"/>
       </w:pPr>
       <w:r>
-        <w:t>sdb shell</w:t>
-      </w:r>
-      <w:r>
-        <w:rPr>
-          <w:rFonts w:hint="eastAsia"/>
-        </w:rPr>
-        <w:t>也提供</w:t>
-      </w:r>
-      <w:r>
-        <w:rPr>
-          <w:rFonts w:hint="eastAsia"/>
-        </w:rPr>
-        <w:t xml:space="preserve"> getLastStatistic() </w:t>
-      </w:r>
-      <w:r>
-        <w:rPr>
-          <w:rFonts w:hint="eastAsia"/>
-        </w:rPr>
-        <w:t>接口，</w:t>
-      </w:r>
-      <w:r>
-        <w:rPr>
-          <w:rFonts w:hint="eastAsia"/>
-        </w:rPr>
-        <w:t>以</w:t>
-      </w:r>
-      <w:r>
-        <w:rPr>
-          <w:rFonts w:hint="eastAsia"/>
-        </w:rPr>
-        <w:t xml:space="preserve"> BSON</w:t>
-      </w:r>
-      <w:r>
-        <w:t xml:space="preserve"> </w:t>
-      </w:r>
-      <w:r>
-        <w:rPr>
-          <w:rFonts w:hint="eastAsia"/>
-        </w:rPr>
-        <w:t>对象的形式返回</w:t>
-      </w:r>
-      <w:r>
-        <w:rPr>
-          <w:rFonts w:hint="eastAsia"/>
-        </w:rPr>
-        <w:t>统计信息对象。</w:t>
-      </w:r>
-      <w:r>
-        <w:rPr>
-          <w:rFonts w:hint="eastAsia"/>
-        </w:rPr>
-        <w:t>对于无统计信息的操作，无返回值。</w:t>
-      </w:r>
-    </w:p>
-    <w:p>
-      <w:pPr>
-        <w:ind w:left="420"/>
-      </w:pPr>
-    </w:p>
-    <w:p>
-      <w:pPr>
-        <w:ind w:left="417"/>
-      </w:pPr>
-      <w:r>
-        <w:rPr>
-          <w:rFonts w:hint="eastAsia"/>
-        </w:rPr>
-        <w:t>在出错的情况下，也可通过该接口获取记录变更的统计信息，同时，在通过</w:t>
-      </w:r>
-      <w:r>
-        <w:rPr>
-          <w:rFonts w:hint="eastAsia"/>
-        </w:rPr>
-        <w:t xml:space="preserve"> getLastErrObj() </w:t>
-      </w:r>
-      <w:r>
-        <w:rPr>
-          <w:rFonts w:hint="eastAsia"/>
-        </w:rPr>
-        <w:t>接口获取错误信息时，该统计信息也包信在错误对象中，以</w:t>
-      </w:r>
-      <w:r>
-        <w:rPr>
-          <w:rFonts w:hint="eastAsia"/>
-        </w:rPr>
-        <w:t xml:space="preserve"> Statistic </w:t>
-      </w:r>
-      <w:r>
-        <w:rPr>
-          <w:rFonts w:hint="eastAsia"/>
-        </w:rPr>
-        <w:t>子对象的形式存在。</w:t>
-      </w:r>
-    </w:p>
-    <w:p>
-      <w:pPr>
-        <w:ind w:left="417"/>
-      </w:pPr>
-    </w:p>
-    <w:p>
-      <w:pPr>
-        <w:rPr>
-          <w:color w:val="FF0000"/>
-        </w:rPr>
-      </w:pPr>
-      <w:r>
-        <w:rPr>
-          <w:color w:val="FF0000"/>
-        </w:rPr>
-        <w:tab/>
-      </w:r>
-      <w:r>
-        <w:rPr>
-          <w:rFonts w:hint="eastAsia"/>
-          <w:color w:val="FF0000"/>
-        </w:rPr>
-        <w:t>为了方便</w:t>
-      </w:r>
-      <w:r>
-        <w:rPr>
-          <w:rFonts w:hint="eastAsia"/>
-          <w:color w:val="FF0000"/>
-        </w:rPr>
-        <w:t xml:space="preserve"> sdb </w:t>
-      </w:r>
-      <w:r>
-        <w:rPr>
-          <w:rFonts w:hint="eastAsia"/>
-          <w:color w:val="FF0000"/>
-        </w:rPr>
-        <w:t>使用，</w:t>
-      </w:r>
-      <w:r>
-        <w:rPr>
-          <w:rFonts w:hint="eastAsia"/>
-          <w:color w:val="FF0000"/>
-        </w:rPr>
-        <w:t>提供在</w:t>
-      </w:r>
-      <w:r>
-        <w:rPr>
-          <w:rFonts w:hint="eastAsia"/>
-          <w:color w:val="FF0000"/>
-        </w:rPr>
-        <w:t xml:space="preserve"> sdb </w:t>
-      </w:r>
-      <w:r>
-        <w:rPr>
-          <w:rFonts w:hint="eastAsia"/>
-          <w:color w:val="FF0000"/>
-        </w:rPr>
-        <w:t>中操作直接返回错误信息或统计信息的能力，同时为了兼容，不改变默认行为，而通过一个接口来打开或关闭，且默认为关闭状态。</w:t>
+        <w:rPr>
+          <w:rFonts w:hint="eastAsia"/>
+        </w:rPr>
+        <w:t>如果在这些操作中有指定其它</w:t>
+      </w:r>
+      <w:r>
+        <w:rPr>
+          <w:rFonts w:hint="eastAsia"/>
+        </w:rPr>
+        <w:t xml:space="preserve"> flag </w:t>
+      </w:r>
+      <w:r>
+        <w:rPr>
+          <w:rFonts w:hint="eastAsia"/>
+        </w:rPr>
+        <w:t>来返回信息（如返回</w:t>
+      </w:r>
+      <w:r>
+        <w:rPr>
+          <w:rFonts w:hint="eastAsia"/>
+        </w:rPr>
+        <w:t xml:space="preserve"> OID</w:t>
+      </w:r>
+      <w:r>
+        <w:rPr>
+          <w:rFonts w:hint="eastAsia"/>
+        </w:rPr>
+        <w:t>），则将这些信息与统计信息整合到一直。</w:t>
       </w:r>
     </w:p>
     <w:p>
@@ -1974,7 +1820,6 @@
         <w:rPr>
           <w:rFonts w:hint="eastAsia"/>
         </w:rPr>
-        <w:lastRenderedPageBreak/>
         <w:t>只能获取当前会话中上一次写操作的统计信息，不能获取之前其它操作的统计信息</w:t>
       </w:r>
     </w:p>
@@ -2045,6 +1890,7 @@
         <w:rPr>
           <w:rFonts w:hint="eastAsia"/>
         </w:rPr>
+        <w:lastRenderedPageBreak/>
         <w:t>相关模块架构图</w:t>
       </w:r>
     </w:p>
@@ -2181,7 +2027,7 @@
                     <pic:cNvPicPr/>
                   </pic:nvPicPr>
                   <pic:blipFill>
-                    <a:blip r:embed="rId9">
+                    <a:blip r:embed="rId7">
                       <a:extLst>
                         <a:ext uri="{28A0092B-C50C-407E-A947-70E740481C1C}">
                           <a14:useLocalDpi xmlns:a14="http://schemas.microsoft.com/office/drawing/2010/main" val="0"/>
@@ -2245,7 +2091,7 @@
                     <pic:cNvPicPr/>
                   </pic:nvPicPr>
                   <pic:blipFill>
-                    <a:blip r:embed="rId10">
+                    <a:blip r:embed="rId8">
                       <a:extLst>
                         <a:ext uri="{28A0092B-C50C-407E-A947-70E740481C1C}">
                           <a14:useLocalDpi xmlns:a14="http://schemas.microsoft.com/office/drawing/2010/main" val="0"/>
@@ -2295,7 +2141,6 @@
         <w:rPr>
           <w:rFonts w:hint="eastAsia"/>
         </w:rPr>
-        <w:lastRenderedPageBreak/>
         <w:t>关键设计</w:t>
       </w:r>
     </w:p>
@@ -2409,6 +2254,7 @@
         <w:rPr>
           <w:rFonts w:hint="eastAsia"/>
         </w:rPr>
+        <w:lastRenderedPageBreak/>
         <w:t>因此，当前</w:t>
       </w:r>
       <w:r>
@@ -2519,7 +2365,7 @@
                     <pic:cNvPicPr/>
                   </pic:nvPicPr>
                   <pic:blipFill>
-                    <a:blip r:embed="rId11">
+                    <a:blip r:embed="rId9">
                       <a:extLst>
                         <a:ext uri="{28A0092B-C50C-407E-A947-70E740481C1C}">
                           <a14:useLocalDpi xmlns:a14="http://schemas.microsoft.com/office/drawing/2010/main" val="0"/>
@@ -2573,106 +2419,6 @@
       </w:r>
     </w:p>
     <w:p>
-      <w:r>
-        <w:rPr>
-          <w:rFonts w:hint="eastAsia"/>
-        </w:rPr>
-        <w:t>而在有错误信息的情况下，由于协调节点也要进行错误信息聚合，当前的框架是直接将应答消息头后的整个对象作为详细错误信息对象。因此为了尽量少影响当前框架，数据节点上将统计信息对象作为一个单独的对象追加到错误信息对象后面，而不是将它们整合成一个对象。</w:t>
-      </w:r>
-      <w:r>
-        <w:rPr>
-          <w:rFonts w:hint="eastAsia"/>
-        </w:rPr>
-        <w:t>这也是考虑到与老版本节点的兼容性。</w:t>
-      </w:r>
-    </w:p>
-    <w:p>
-      <w:pPr>
-        <w:jc w:val="center"/>
-      </w:pPr>
-      <w:commentRangeStart w:id="10"/>
-      <w:r>
-        <w:rPr>
-          <w:rFonts w:hint="eastAsia"/>
-          <w:noProof/>
-        </w:rPr>
-        <w:drawing>
-          <wp:inline distT="0" distB="0" distL="0" distR="0" wp14:anchorId="5DEF15E0" wp14:editId="382725EA">
-            <wp:extent cx="2608565" cy="903554"/>
-            <wp:effectExtent l="0" t="0" r="0" b="0"/>
-            <wp:docPr id="4" name="图片 4"/>
-            <wp:cNvGraphicFramePr>
-              <a:graphicFrameLocks xmlns:a="http://schemas.openxmlformats.org/drawingml/2006/main" noChangeAspect="1"/>
-            </wp:cNvGraphicFramePr>
-            <a:graphic xmlns:a="http://schemas.openxmlformats.org/drawingml/2006/main">
-              <a:graphicData uri="http://schemas.openxmlformats.org/drawingml/2006/picture">
-                <pic:pic xmlns:pic="http://schemas.openxmlformats.org/drawingml/2006/picture">
-                  <pic:nvPicPr>
-                    <pic:cNvPr id="4" name="statistic-reply-on-failure.png"/>
-                    <pic:cNvPicPr/>
-                  </pic:nvPicPr>
-                  <pic:blipFill>
-                    <a:blip r:embed="rId12">
-                      <a:extLst>
-                        <a:ext uri="{28A0092B-C50C-407E-A947-70E740481C1C}">
-                          <a14:useLocalDpi xmlns:a14="http://schemas.microsoft.com/office/drawing/2010/main" val="0"/>
-                        </a:ext>
-                      </a:extLst>
-                    </a:blip>
-                    <a:stretch>
-                      <a:fillRect/>
-                    </a:stretch>
-                  </pic:blipFill>
-                  <pic:spPr>
-                    <a:xfrm>
-                      <a:off x="0" y="0"/>
-                      <a:ext cx="2629729" cy="910885"/>
-                    </a:xfrm>
-                    <a:prstGeom prst="rect">
-                      <a:avLst/>
-                    </a:prstGeom>
-                  </pic:spPr>
-                </pic:pic>
-              </a:graphicData>
-            </a:graphic>
-          </wp:inline>
-        </w:drawing>
-      </w:r>
-      <w:commentRangeEnd w:id="10"/>
-      <w:r>
-        <w:rPr>
-          <w:rStyle w:val="ad"/>
-        </w:rPr>
-        <w:commentReference w:id="10"/>
-      </w:r>
-    </w:p>
-    <w:p>
-      <w:pPr>
-        <w:jc w:val="center"/>
-      </w:pPr>
-      <w:r>
-        <w:rPr>
-          <w:rFonts w:hint="eastAsia"/>
-        </w:rPr>
-        <w:t>图</w:t>
-      </w:r>
-      <w:r>
-        <w:rPr>
-          <w:rFonts w:hint="eastAsia"/>
-        </w:rPr>
-        <w:t>2</w:t>
-      </w:r>
-      <w:r>
-        <w:t xml:space="preserve"> </w:t>
-      </w:r>
-      <w:r>
-        <w:rPr>
-          <w:rFonts w:hint="eastAsia"/>
-        </w:rPr>
-        <w:t>操作失败应答消息变更</w:t>
-      </w:r>
-    </w:p>
-    <w:p>
       <w:pPr>
         <w:jc w:val="left"/>
       </w:pPr>
@@ -2680,7 +2426,13 @@
         <w:rPr>
           <w:rFonts w:hint="eastAsia"/>
         </w:rPr>
-        <w:t>但在协调节点上整合之后，则将聚合之后的统计信息对象</w:t>
+        <w:t>在操作出错的情况下，则将统计信息</w:t>
+      </w:r>
+      <w:r>
+        <w:rPr>
+          <w:rFonts w:hint="eastAsia"/>
+        </w:rPr>
+        <w:t>信息对象</w:t>
       </w:r>
       <w:r>
         <w:rPr>
@@ -2762,7 +2514,7 @@
                     <pic:cNvPicPr/>
                   </pic:nvPicPr>
                   <pic:blipFill>
-                    <a:blip r:embed="rId13">
+                    <a:blip r:embed="rId10">
                       <a:extLst>
                         <a:ext uri="{28A0092B-C50C-407E-A947-70E740481C1C}">
                           <a14:useLocalDpi xmlns:a14="http://schemas.microsoft.com/office/drawing/2010/main" val="0"/>
@@ -2797,7 +2549,6 @@
         <w:rPr>
           <w:rFonts w:hint="eastAsia"/>
         </w:rPr>
-        <w:lastRenderedPageBreak/>
         <w:t>数据节点上的统计信息生成及发送</w:t>
       </w:r>
     </w:p>
@@ -3017,11 +2768,11 @@
       <w:pPr>
         <w:pStyle w:val="5"/>
       </w:pPr>
-      <w:commentRangeStart w:id="11"/>
-      <w:r>
-        <w:rPr>
-          <w:rFonts w:hint="eastAsia"/>
-        </w:rPr>
+      <w:r>
+        <w:rPr>
+          <w:rFonts w:hint="eastAsia"/>
+        </w:rPr>
+        <w:lastRenderedPageBreak/>
         <w:t>信息</w:t>
       </w:r>
       <w:r>
@@ -3029,18 +2780,14 @@
           <w:rFonts w:hint="eastAsia"/>
         </w:rPr>
         <w:t>存储</w:t>
-      </w:r>
-      <w:commentRangeEnd w:id="11"/>
-      <w:r>
-        <w:rPr>
-          <w:rStyle w:val="ad"/>
-          <w:rFonts w:asciiTheme="minorHAnsi" w:eastAsiaTheme="minorEastAsia" w:hAnsiTheme="minorHAnsi" w:cstheme="minorBidi"/>
-          <w:color w:val="auto"/>
-        </w:rPr>
-        <w:commentReference w:id="11"/>
       </w:r>
     </w:p>
     <w:p>
+      <w:pPr>
+        <w:rPr>
+          <w:b/>
+        </w:rPr>
+      </w:pPr>
       <w:r>
         <w:rPr>
           <w:rFonts w:hint="eastAsia"/>
@@ -3051,227 +2798,49 @@
         <w:rPr>
           <w:rFonts w:hint="eastAsia"/>
         </w:rPr>
+        <w:t>操作状态监控类</w:t>
+      </w:r>
+      <w:r>
+        <w:t>monOperationCB</w:t>
+      </w:r>
+      <w:r>
+        <w:rPr>
+          <w:rFonts w:hint="eastAsia"/>
+        </w:rPr>
+        <w:t>，</w:t>
+      </w:r>
+      <w:r>
+        <w:rPr>
+          <w:rFonts w:hint="eastAsia"/>
+        </w:rPr>
+        <w:t>在</w:t>
+      </w:r>
+      <w:r>
+        <w:rPr>
+          <w:rFonts w:hint="eastAsia"/>
+        </w:rPr>
         <w:t xml:space="preserve"> rtn </w:t>
       </w:r>
       <w:r>
         <w:rPr>
           <w:rFonts w:hint="eastAsia"/>
         </w:rPr>
-        <w:t>层的操作状态类</w:t>
-      </w:r>
-      <w:r>
-        <w:rPr>
-          <w:rFonts w:hint="eastAsia"/>
-        </w:rPr>
-        <w:t xml:space="preserve"> rtnOpStat</w:t>
-      </w:r>
-      <w:r>
-        <w:rPr>
-          <w:rFonts w:hint="eastAsia"/>
-        </w:rPr>
-        <w:t>，它可用来同时收集统计信息及错误信息，并提供接口将这两种类型的信息转换成最终的</w:t>
-      </w:r>
-      <w:r>
-        <w:rPr>
-          <w:rFonts w:hint="eastAsia"/>
-        </w:rPr>
-        <w:t xml:space="preserve"> BSON </w:t>
-      </w:r>
-      <w:r>
-        <w:rPr>
-          <w:rFonts w:hint="eastAsia"/>
-        </w:rPr>
-        <w:t>对象。</w:t>
-      </w:r>
-    </w:p>
-    <w:p>
-      <w:r>
-        <w:rPr>
-          <w:rFonts w:hint="eastAsia"/>
-        </w:rPr>
-        <w:t>操作的统计信息只面向一次操作，其生命周期也只是单次操作。</w:t>
-      </w:r>
-      <w:r>
-        <w:rPr>
-          <w:rFonts w:hint="eastAsia"/>
-        </w:rPr>
-        <w:t>在操作应答消息发送完成后，统计信息即可销毁。在各个会话线程中，它们是独立的。</w:t>
-      </w:r>
-    </w:p>
-    <w:p>
-      <w:r>
-        <w:rPr>
-          <w:rFonts w:hint="eastAsia"/>
-        </w:rPr>
-        <w:t>对于直连（包括单机模式），由于不涉及在协调节点上的信息聚合，其返回结果只包含一个</w:t>
-      </w:r>
-      <w:r>
-        <w:rPr>
-          <w:rFonts w:hint="eastAsia"/>
-        </w:rPr>
-        <w:t xml:space="preserve"> BSON </w:t>
-      </w:r>
-      <w:r>
-        <w:rPr>
-          <w:rFonts w:hint="eastAsia"/>
-        </w:rPr>
-        <w:t>对象（可能包括错误信息）。在实际生成时，</w:t>
-      </w:r>
-      <w:r>
-        <w:rPr>
-          <w:rFonts w:hint="eastAsia"/>
-        </w:rPr>
-        <w:t>只使用临时的对象，供框架中的</w:t>
-      </w:r>
-      <w:r>
-        <w:rPr>
-          <w:rFonts w:hint="eastAsia"/>
-        </w:rPr>
-        <w:t xml:space="preserve"> rtnContextBuff </w:t>
-      </w:r>
-      <w:r>
-        <w:rPr>
-          <w:rFonts w:hint="eastAsia"/>
-        </w:rPr>
-        <w:t>引用即可。</w:t>
-      </w:r>
-      <w:r>
-        <w:rPr>
-          <w:rFonts w:hint="eastAsia"/>
-        </w:rPr>
-        <w:t>因此，对于协调节点和本地处理流程，只在各处理器中使用临时的状态对象即可。</w:t>
-      </w:r>
-    </w:p>
-    <w:p>
-      <w:r>
-        <w:rPr>
-          <w:rFonts w:hint="eastAsia"/>
-        </w:rPr>
-        <w:t>而对于分布式环境下的数据节点，如前面所述，返回给协调节点的错误信息和统计信息使用两个独立的</w:t>
-      </w:r>
-      <w:r>
-        <w:rPr>
-          <w:rFonts w:hint="eastAsia"/>
-        </w:rPr>
-        <w:t xml:space="preserve"> BSON </w:t>
-      </w:r>
-      <w:r>
-        <w:rPr>
-          <w:rFonts w:hint="eastAsia"/>
-        </w:rPr>
-        <w:t>对象。为了使用统一的框架来引用和发送多个对象，在</w:t>
-      </w:r>
-      <w:r>
-        <w:rPr>
-          <w:rFonts w:hint="eastAsia"/>
-        </w:rPr>
-        <w:t xml:space="preserve"> shardSession </w:t>
-      </w:r>
-      <w:r>
-        <w:rPr>
-          <w:rFonts w:hint="eastAsia"/>
-        </w:rPr>
-        <w:t>上提供一了</w:t>
-      </w:r>
-      <w:r>
-        <w:rPr>
-          <w:rFonts w:hint="eastAsia"/>
-        </w:rPr>
-        <w:t xml:space="preserve">_utilCommBuff </w:t>
-      </w:r>
-      <w:r>
-        <w:rPr>
-          <w:rFonts w:hint="eastAsia"/>
-        </w:rPr>
-        <w:t>的对象作为缓存，用来缓存这两个对象，其初始大小为</w:t>
-      </w:r>
-      <w:r>
-        <w:rPr>
-          <w:rFonts w:hint="eastAsia"/>
-        </w:rPr>
-        <w:t xml:space="preserve"> 256 </w:t>
-      </w:r>
-      <w:r>
-        <w:rPr>
-          <w:rFonts w:hint="eastAsia"/>
-        </w:rPr>
-        <w:t>字节，最大大小为</w:t>
-      </w:r>
-      <w:r>
-        <w:rPr>
-          <w:rFonts w:hint="eastAsia"/>
-        </w:rPr>
-        <w:t xml:space="preserve"> 2KB</w:t>
-      </w:r>
-      <w:r>
-        <w:rPr>
-          <w:rFonts w:hint="eastAsia"/>
-        </w:rPr>
-        <w:t>。</w:t>
-      </w:r>
-    </w:p>
-    <w:p>
-      <w:pPr>
-        <w:jc w:val="center"/>
-        <w:rPr>
-          <w:b/>
-        </w:rPr>
-      </w:pPr>
-      <w:r>
-        <w:rPr>
-          <w:rFonts w:hint="eastAsia"/>
-          <w:b/>
-          <w:noProof/>
-        </w:rPr>
-        <w:lastRenderedPageBreak/>
-        <w:drawing>
-          <wp:inline distT="0" distB="0" distL="0" distR="0" wp14:anchorId="21E40B30" wp14:editId="299BA1DC">
-            <wp:extent cx="5274310" cy="3110153"/>
-            <wp:effectExtent l="0" t="0" r="0" b="0"/>
-            <wp:docPr id="10" name="图片 10"/>
-            <wp:cNvGraphicFramePr>
-              <a:graphicFrameLocks xmlns:a="http://schemas.openxmlformats.org/drawingml/2006/main" noChangeAspect="1"/>
-            </wp:cNvGraphicFramePr>
-            <a:graphic xmlns:a="http://schemas.openxmlformats.org/drawingml/2006/main">
-              <a:graphicData uri="http://schemas.openxmlformats.org/drawingml/2006/picture">
-                <pic:pic xmlns:pic="http://schemas.openxmlformats.org/drawingml/2006/picture">
-                  <pic:nvPicPr>
-                    <pic:cNvPr id="0" name="Picture 3"/>
-                    <pic:cNvPicPr>
-                      <a:picLocks noChangeAspect="1" noChangeArrowheads="1"/>
-                    </pic:cNvPicPr>
-                  </pic:nvPicPr>
-                  <pic:blipFill>
-                    <a:blip r:embed="rId14">
-                      <a:extLst>
-                        <a:ext uri="{28A0092B-C50C-407E-A947-70E740481C1C}">
-                          <a14:useLocalDpi xmlns:a14="http://schemas.microsoft.com/office/drawing/2010/main" val="0"/>
-                        </a:ext>
-                      </a:extLst>
-                    </a:blip>
-                    <a:srcRect/>
-                    <a:stretch>
-                      <a:fillRect/>
-                    </a:stretch>
-                  </pic:blipFill>
-                  <pic:spPr bwMode="auto">
-                    <a:xfrm>
-                      <a:off x="0" y="0"/>
-                      <a:ext cx="5274310" cy="3110153"/>
-                    </a:xfrm>
-                    <a:prstGeom prst="rect">
-                      <a:avLst/>
-                    </a:prstGeom>
-                    <a:noFill/>
-                    <a:ln>
-                      <a:noFill/>
-                    </a:ln>
-                  </pic:spPr>
-                </pic:pic>
-              </a:graphicData>
-            </a:graphic>
-          </wp:inline>
-        </w:drawing>
+        <w:t>层封装相关宏，在</w:t>
+      </w:r>
+      <w:r>
+        <w:rPr>
+          <w:rFonts w:hint="eastAsia"/>
+        </w:rPr>
+        <w:t xml:space="preserve"> r</w:t>
+      </w:r>
+      <w:r>
+        <w:t xml:space="preserve">tn </w:t>
+      </w:r>
+      <w:r>
+        <w:rPr>
+          <w:rFonts w:hint="eastAsia"/>
+        </w:rPr>
+        <w:t>层的操作接口中，在获取到操作结果后，使用该宏来进行数据更新。</w:t>
       </w:r>
     </w:p>
     <w:p/>
@@ -3461,7 +3030,7 @@
                     <pic:cNvPicPr/>
                   </pic:nvPicPr>
                   <pic:blipFill>
-                    <a:blip r:embed="rId15">
+                    <a:blip r:embed="rId11">
                       <a:extLst>
                         <a:ext uri="{28A0092B-C50C-407E-A947-70E740481C1C}">
                           <a14:useLocalDpi xmlns:a14="http://schemas.microsoft.com/office/drawing/2010/main" val="0"/>
@@ -3519,7 +3088,6 @@
         <w:rPr>
           <w:rFonts w:hint="eastAsia"/>
         </w:rPr>
-        <w:lastRenderedPageBreak/>
         <w:t>驱动</w:t>
       </w:r>
       <w:r>
@@ -3762,7 +3330,14 @@
         <w:rPr>
           <w:rFonts w:hint="eastAsia"/>
         </w:rPr>
-        <w:t>定位到统计信息对象的位置。</w:t>
+        <w:t>定</w:t>
+      </w:r>
+      <w:r>
+        <w:rPr>
+          <w:rFonts w:hint="eastAsia"/>
+        </w:rPr>
+        <w:lastRenderedPageBreak/>
+        <w:t>位到统计信息对象的位置。</w:t>
       </w:r>
     </w:p>
     <w:p>
@@ -3795,7 +3370,22 @@
         <w:rPr>
           <w:rFonts w:hint="eastAsia"/>
         </w:rPr>
-        <w:t xml:space="preserve"> getLastStatistic() </w:t>
+        <w:t xml:space="preserve"> getLast</w:t>
+      </w:r>
+      <w:r>
+        <w:t>ResultObj</w:t>
+      </w:r>
+      <w:r>
+        <w:rPr>
+          <w:rFonts w:hint="eastAsia"/>
+        </w:rPr>
+        <w:t xml:space="preserve"> </w:t>
+      </w:r>
+      <w:r>
+        <w:rPr>
+          <w:rFonts w:hint="eastAsia"/>
+        </w:rPr>
+        <w:t xml:space="preserve">() </w:t>
       </w:r>
       <w:r>
         <w:rPr>
@@ -4473,7 +4063,6 @@
         <w:rPr>
           <w:rFonts w:hint="eastAsia"/>
         </w:rPr>
-        <w:lastRenderedPageBreak/>
         <w:t>验收</w:t>
       </w:r>
       <w:r>
@@ -4722,7 +4311,16 @@
               <w:rPr>
                 <w:rFonts w:hint="eastAsia"/>
               </w:rPr>
-              <w:t xml:space="preserve">getLastStatistic() </w:t>
+              <w:t>getLast</w:t>
+            </w:r>
+            <w:r>
+              <w:t>ResultObj</w:t>
+            </w:r>
+            <w:r>
+              <w:rPr>
+                <w:rFonts w:hint="eastAsia"/>
+              </w:rPr>
+              <w:t xml:space="preserve">() </w:t>
             </w:r>
             <w:r>
               <w:rPr>
@@ -4918,7 +4516,22 @@
               <w:rPr>
                 <w:rFonts w:hint="eastAsia"/>
               </w:rPr>
-              <w:t xml:space="preserve">getLastStatistic() </w:t>
+              <w:t>getLast</w:t>
+            </w:r>
+            <w:r>
+              <w:t>ResultObj</w:t>
+            </w:r>
+            <w:r>
+              <w:rPr>
+                <w:rFonts w:hint="eastAsia"/>
+              </w:rPr>
+              <w:t xml:space="preserve"> </w:t>
+            </w:r>
+            <w:r>
+              <w:rPr>
+                <w:rFonts w:hint="eastAsia"/>
+              </w:rPr>
+              <w:t xml:space="preserve">() </w:t>
             </w:r>
             <w:r>
               <w:rPr>
@@ -5062,6 +4675,7 @@
               <w:rPr>
                 <w:rFonts w:hint="eastAsia"/>
               </w:rPr>
+              <w:lastRenderedPageBreak/>
               <w:t>使用驱动</w:t>
             </w:r>
             <w:r>
@@ -5138,7 +4752,22 @@
               <w:rPr>
                 <w:rFonts w:hint="eastAsia"/>
               </w:rPr>
-              <w:t xml:space="preserve">getLastStatistic() </w:t>
+              <w:t>getLast</w:t>
+            </w:r>
+            <w:r>
+              <w:t>ResultObj</w:t>
+            </w:r>
+            <w:r>
+              <w:rPr>
+                <w:rFonts w:hint="eastAsia"/>
+              </w:rPr>
+              <w:t xml:space="preserve"> </w:t>
+            </w:r>
+            <w:r>
+              <w:rPr>
+                <w:rFonts w:hint="eastAsia"/>
+              </w:rPr>
+              <w:t xml:space="preserve">() </w:t>
             </w:r>
             <w:r>
               <w:rPr>
@@ -5160,7 +4789,15 @@
               <w:rPr>
                 <w:rFonts w:hint="eastAsia"/>
               </w:rPr>
-              <w:t>能正常查询到统计信息，查询结果中，</w:t>
+              <w:lastRenderedPageBreak/>
+              <w:t>能正常查询到统计信息，查询结</w:t>
+            </w:r>
+            <w:r>
+              <w:rPr>
+                <w:rFonts w:hint="eastAsia"/>
+              </w:rPr>
+              <w:lastRenderedPageBreak/>
+              <w:t>果中，</w:t>
             </w:r>
             <w:r>
               <w:rPr>
@@ -5214,6 +4851,7 @@
               <w:ind w:left="0"/>
             </w:pPr>
             <w:r>
+              <w:lastRenderedPageBreak/>
               <w:t>4</w:t>
             </w:r>
           </w:p>
@@ -5340,7 +4978,22 @@
               <w:rPr>
                 <w:rFonts w:hint="eastAsia"/>
               </w:rPr>
-              <w:t xml:space="preserve">getLastStatistic() </w:t>
+              <w:t>getLast</w:t>
+            </w:r>
+            <w:r>
+              <w:t>ResultObj</w:t>
+            </w:r>
+            <w:r>
+              <w:rPr>
+                <w:rFonts w:hint="eastAsia"/>
+              </w:rPr>
+              <w:t xml:space="preserve"> </w:t>
+            </w:r>
+            <w:r>
+              <w:rPr>
+                <w:rFonts w:hint="eastAsia"/>
+              </w:rPr>
+              <w:t xml:space="preserve">() </w:t>
             </w:r>
             <w:r>
               <w:rPr>
@@ -5575,7 +5228,24 @@
               <w:rPr>
                 <w:rFonts w:hint="eastAsia"/>
               </w:rPr>
-              <w:t xml:space="preserve">getLastStatistic() </w:t>
+              <w:t>getLast</w:t>
+            </w:r>
+            <w:r>
+              <w:t>ResultObj</w:t>
+            </w:r>
+            <w:r>
+              <w:rPr>
+                <w:rFonts w:hint="eastAsia"/>
+              </w:rPr>
+              <w:t xml:space="preserve"> </w:t>
+            </w:r>
+            <w:bookmarkStart w:id="2" w:name="_GoBack"/>
+            <w:bookmarkEnd w:id="2"/>
+            <w:r>
+              <w:rPr>
+                <w:rFonts w:hint="eastAsia"/>
+              </w:rPr>
+              <w:t xml:space="preserve">() </w:t>
             </w:r>
             <w:r>
               <w:rPr>
@@ -5711,7 +5381,6 @@
               <w:rPr>
                 <w:rFonts w:hint="eastAsia"/>
               </w:rPr>
-              <w:lastRenderedPageBreak/>
               <w:t>在出错的情况下，则出错操作的统计信息中，要将本事务中之前操作的回滚动作的数据变更计算在内</w:t>
             </w:r>
           </w:p>
@@ -5726,7 +5395,6 @@
         <w:rPr>
           <w:rFonts w:hint="eastAsia"/>
         </w:rPr>
-        <w:lastRenderedPageBreak/>
         <w:t>Checklist</w:t>
       </w:r>
     </w:p>
@@ -5964,6 +5632,7 @@
               <w:rPr>
                 <w:rFonts w:hint="eastAsia"/>
               </w:rPr>
+              <w:lastRenderedPageBreak/>
               <w:t>验收用例是否全部通过</w:t>
             </w:r>
           </w:p>
@@ -6204,414 +5873,6 @@
     </w:sectPr>
   </w:body>
 </w:document>
-</file>
-
-<file path=word/comments.xml><?xml version="1.0" encoding="utf-8"?>
-<w:comments xmlns:wpc="http://schemas.microsoft.com/office/word/2010/wordprocessingCanvas" xmlns:cx="http://schemas.microsoft.com/office/drawing/2014/chartex" xmlns:mc="http://schemas.openxmlformats.org/markup-compatibility/2006" xmlns:o="urn:schemas-microsoft-com:office:office" xmlns:r="http://schemas.openxmlformats.org/officeDocument/2006/relationships" xmlns:m="http://schemas.openxmlformats.org/officeDocument/2006/math" xmlns:v="urn:schemas-microsoft-com:vml" xmlns:wp14="http://schemas.microsoft.com/office/word/2010/wordprocessingDrawing" xmlns:wp="http://schemas.openxmlformats.org/drawingml/2006/wordprocessingDrawing" xmlns:w10="urn:schemas-microsoft-com:office:word" xmlns:w="http://schemas.openxmlformats.org/wordprocessingml/2006/main" xmlns:w14="http://schemas.microsoft.com/office/word/2010/wordml" xmlns:w15="http://schemas.microsoft.com/office/word/2012/wordml" xmlns:w16se="http://schemas.microsoft.com/office/word/2015/wordml/symex" xmlns:wpg="http://schemas.microsoft.com/office/word/2010/wordprocessingGroup" xmlns:wpi="http://schemas.microsoft.com/office/word/2010/wordprocessingInk" xmlns:wne="http://schemas.microsoft.com/office/word/2006/wordml" xmlns:wps="http://schemas.microsoft.com/office/word/2010/wordprocessingShape" mc:Ignorable="w14 w15 w16se wp14">
-  <w:comment w:id="2" w:author="yangshangde" w:date="2018-12-22T13:49:00Z" w:initials="y">
-    <w:p>
-      <w:pPr>
-        <w:pStyle w:val="ae"/>
-      </w:pPr>
-      <w:r>
-        <w:rPr>
-          <w:rStyle w:val="ad"/>
-        </w:rPr>
-        <w:annotationRef/>
-      </w:r>
-      <w:r>
-        <w:rPr>
-          <w:rFonts w:hint="eastAsia"/>
-        </w:rPr>
-        <w:t>保留一层即可，去掉</w:t>
-      </w:r>
-      <w:r>
-        <w:rPr>
-          <w:rFonts w:hint="eastAsia"/>
-        </w:rPr>
-        <w:t xml:space="preserve">statistic </w:t>
-      </w:r>
-      <w:r>
-        <w:rPr>
-          <w:rFonts w:hint="eastAsia"/>
-        </w:rPr>
-        <w:t>层</w:t>
-      </w:r>
-    </w:p>
-  </w:comment>
-  <w:comment w:id="3" w:author="yangshangde" w:date="2018-12-22T13:47:00Z" w:initials="y">
-    <w:p>
-      <w:pPr>
-        <w:pStyle w:val="ae"/>
-      </w:pPr>
-      <w:r>
-        <w:rPr>
-          <w:rStyle w:val="ad"/>
-        </w:rPr>
-        <w:annotationRef/>
-      </w:r>
-      <w:r>
-        <w:rPr>
-          <w:rFonts w:hint="eastAsia"/>
-        </w:rPr>
-        <w:t>名称调整：</w:t>
-      </w:r>
-      <w:r>
-        <w:t>InsertCount</w:t>
-      </w:r>
-    </w:p>
-    <w:p>
-      <w:pPr>
-        <w:pStyle w:val="ae"/>
-        <w:rPr>
-          <w:rFonts w:hint="eastAsia"/>
-        </w:rPr>
-      </w:pPr>
-      <w:r>
-        <w:rPr>
-          <w:rFonts w:hint="eastAsia"/>
-        </w:rPr>
-        <w:t>添加</w:t>
-      </w:r>
-      <w:r>
-        <w:rPr>
-          <w:rFonts w:hint="eastAsia"/>
-        </w:rPr>
-        <w:t xml:space="preserve"> IgnoreCount</w:t>
-      </w:r>
-    </w:p>
-  </w:comment>
-  <w:comment w:id="4" w:author="yangshangde" w:date="2018-12-22T13:52:00Z" w:initials="y">
-    <w:p>
-      <w:pPr>
-        <w:pStyle w:val="ae"/>
-      </w:pPr>
-      <w:r>
-        <w:rPr>
-          <w:rStyle w:val="ad"/>
-        </w:rPr>
-        <w:annotationRef/>
-      </w:r>
-      <w:r>
-        <w:rPr>
-          <w:rFonts w:hint="eastAsia"/>
-        </w:rPr>
-        <w:t>类型统一为</w:t>
-      </w:r>
-      <w:r>
-        <w:rPr>
-          <w:rFonts w:hint="eastAsia"/>
-        </w:rPr>
-        <w:t xml:space="preserve"> INT64</w:t>
-      </w:r>
-    </w:p>
-  </w:comment>
-  <w:comment w:id="5" w:author="yangshangde" w:date="2018-12-22T13:53:00Z" w:initials="y">
-    <w:p>
-      <w:pPr>
-        <w:pStyle w:val="ae"/>
-      </w:pPr>
-      <w:r>
-        <w:rPr>
-          <w:rStyle w:val="ad"/>
-        </w:rPr>
-        <w:annotationRef/>
-      </w:r>
-      <w:r>
-        <w:rPr>
-          <w:rFonts w:hint="eastAsia"/>
-        </w:rPr>
-        <w:t>加上</w:t>
-      </w:r>
-      <w:r>
-        <w:rPr>
-          <w:rFonts w:hint="eastAsia"/>
-        </w:rPr>
-        <w:t xml:space="preserve"> IgnoreCount</w:t>
-      </w:r>
-    </w:p>
-  </w:comment>
-  <w:comment w:id="6" w:author="yangshangde" w:date="2018-12-22T14:25:00Z" w:initials="y">
-    <w:p>
-      <w:pPr>
-        <w:pStyle w:val="ae"/>
-      </w:pPr>
-      <w:r>
-        <w:rPr>
-          <w:rStyle w:val="ad"/>
-        </w:rPr>
-        <w:annotationRef/>
-      </w:r>
-      <w:r>
-        <w:rPr>
-          <w:rFonts w:hint="eastAsia"/>
-        </w:rPr>
-        <w:t>驱动对统计信息的解析，不要通过</w:t>
-      </w:r>
-      <w:r>
-        <w:rPr>
-          <w:rFonts w:hint="eastAsia"/>
-        </w:rPr>
-        <w:t xml:space="preserve"> </w:t>
-      </w:r>
-      <w:r>
-        <w:rPr>
-          <w:rFonts w:hint="eastAsia"/>
-        </w:rPr>
-        <w:t>在公共接口中拉回</w:t>
-      </w:r>
-      <w:r>
-        <w:rPr>
-          <w:rFonts w:hint="eastAsia"/>
-        </w:rPr>
-        <w:t xml:space="preserve"> withStat </w:t>
-      </w:r>
-      <w:r>
-        <w:rPr>
-          <w:rFonts w:hint="eastAsia"/>
-        </w:rPr>
-        <w:t>的方式，可由</w:t>
-      </w:r>
-    </w:p>
-  </w:comment>
-  <w:comment w:id="7" w:author="yangshangde" w:date="2018-12-22T13:53:00Z" w:initials="y">
-    <w:p>
-      <w:pPr>
-        <w:pStyle w:val="ae"/>
-      </w:pPr>
-      <w:r>
-        <w:rPr>
-          <w:rStyle w:val="ad"/>
-        </w:rPr>
-        <w:annotationRef/>
-      </w:r>
-      <w:r>
-        <w:t>getLast</w:t>
-      </w:r>
-      <w:r>
-        <w:t>Result</w:t>
-      </w:r>
-      <w:r>
-        <w:t>Obj</w:t>
-      </w:r>
-    </w:p>
-  </w:comment>
-  <w:comment w:id="8" w:author="yangshangde" w:date="2018-12-22T13:57:00Z" w:initials="y">
-    <w:p>
-      <w:pPr>
-        <w:pStyle w:val="ae"/>
-        <w:ind w:left="0"/>
-      </w:pPr>
-      <w:r>
-        <w:rPr>
-          <w:rStyle w:val="ad"/>
-        </w:rPr>
-        <w:annotationRef/>
-      </w:r>
-      <w:r>
-        <w:t xml:space="preserve">shell </w:t>
-      </w:r>
-      <w:r>
-        <w:rPr>
-          <w:rFonts w:hint="eastAsia"/>
-        </w:rPr>
-        <w:t>中给</w:t>
-      </w:r>
-      <w:r>
-        <w:rPr>
-          <w:rFonts w:hint="eastAsia"/>
-        </w:rPr>
-        <w:t xml:space="preserve"> insert/update/delete </w:t>
-      </w:r>
-      <w:r>
-        <w:rPr>
-          <w:rFonts w:hint="eastAsia"/>
-        </w:rPr>
-        <w:t>返回一个</w:t>
-      </w:r>
-      <w:r>
-        <w:rPr>
-          <w:rFonts w:hint="eastAsia"/>
-        </w:rPr>
-        <w:t xml:space="preserve"> BSON</w:t>
-      </w:r>
-      <w:r>
-        <w:rPr>
-          <w:rFonts w:hint="eastAsia"/>
-        </w:rPr>
-        <w:t>对象，不用额外调用接口，在</w:t>
-      </w:r>
-      <w:r>
-        <w:rPr>
-          <w:rFonts w:hint="eastAsia"/>
-        </w:rPr>
-        <w:t xml:space="preserve"> shell </w:t>
-      </w:r>
-      <w:r>
-        <w:rPr>
-          <w:rFonts w:hint="eastAsia"/>
-        </w:rPr>
-        <w:t>中直接显示</w:t>
-      </w:r>
-    </w:p>
-  </w:comment>
-  <w:comment w:id="9" w:author="yangshangde" w:date="2018-12-22T14:47:00Z" w:initials="y">
-    <w:p>
-      <w:pPr>
-        <w:pStyle w:val="ae"/>
-        <w:ind w:left="0"/>
-        <w:rPr>
-          <w:rFonts w:hint="eastAsia"/>
-        </w:rPr>
-      </w:pPr>
-      <w:r>
-        <w:rPr>
-          <w:rStyle w:val="ad"/>
-        </w:rPr>
-        <w:annotationRef/>
-      </w:r>
-      <w:r>
-        <w:rPr>
-          <w:rFonts w:hint="eastAsia"/>
-        </w:rPr>
-        <w:t>插入现有</w:t>
-      </w:r>
-      <w:r>
-        <w:rPr>
-          <w:rFonts w:hint="eastAsia"/>
-        </w:rPr>
-        <w:t xml:space="preserve">flag </w:t>
-      </w:r>
-      <w:r>
-        <w:rPr>
-          <w:rFonts w:hint="eastAsia"/>
-        </w:rPr>
-        <w:t>的结果需要与</w:t>
-      </w:r>
-      <w:r>
-        <w:rPr>
-          <w:rFonts w:hint="eastAsia"/>
-        </w:rPr>
-        <w:t xml:space="preserve"> write </w:t>
-      </w:r>
-      <w:r>
-        <w:rPr>
-          <w:rFonts w:hint="eastAsia"/>
-        </w:rPr>
-        <w:t>合并，在</w:t>
-      </w:r>
-      <w:r>
-        <w:rPr>
-          <w:rFonts w:hint="eastAsia"/>
-        </w:rPr>
-        <w:t xml:space="preserve"> js </w:t>
-      </w:r>
-      <w:r>
-        <w:rPr>
-          <w:rFonts w:hint="eastAsia"/>
-        </w:rPr>
-        <w:t>中处理。</w:t>
-      </w:r>
-    </w:p>
-  </w:comment>
-  <w:comment w:id="10" w:author="yangshangde" w:date="2018-12-22T14:55:00Z" w:initials="y">
-    <w:p>
-      <w:pPr>
-        <w:pStyle w:val="ae"/>
-      </w:pPr>
-      <w:r>
-        <w:rPr>
-          <w:rStyle w:val="ad"/>
-        </w:rPr>
-        <w:annotationRef/>
-      </w:r>
-      <w:r>
-        <w:rPr>
-          <w:rFonts w:hint="eastAsia"/>
-        </w:rPr>
-        <w:t>协调节点上</w:t>
-      </w:r>
-      <w:r>
-        <w:rPr>
-          <w:rFonts w:hint="eastAsia"/>
-        </w:rPr>
-        <w:t xml:space="preserve"> errNodes </w:t>
-      </w:r>
-      <w:r>
-        <w:rPr>
-          <w:rFonts w:hint="eastAsia"/>
-        </w:rPr>
-        <w:t>中可以保留原始的统计信息，保证消息结构上的一致</w:t>
-      </w:r>
-    </w:p>
-  </w:comment>
-  <w:comment w:id="11" w:author="yangshangde" w:date="2018-12-22T15:00:00Z" w:initials="y">
-    <w:p>
-      <w:pPr>
-        <w:pStyle w:val="ae"/>
-        <w:rPr>
-          <w:rFonts w:hint="eastAsia"/>
-        </w:rPr>
-      </w:pPr>
-      <w:r>
-        <w:rPr>
-          <w:rStyle w:val="ad"/>
-        </w:rPr>
-        <w:annotationRef/>
-      </w:r>
-      <w:r>
-        <w:rPr>
-          <w:rFonts w:hint="eastAsia"/>
-        </w:rPr>
-        <w:t>的</w:t>
-      </w:r>
-      <w:r>
-        <w:rPr>
-          <w:rFonts w:hint="eastAsia"/>
-        </w:rPr>
-        <w:t xml:space="preserve"> monApp</w:t>
-      </w:r>
-      <w:r>
-        <w:t xml:space="preserve">CB </w:t>
-      </w:r>
-      <w:r>
-        <w:rPr>
-          <w:rFonts w:hint="eastAsia"/>
-        </w:rPr>
-        <w:t>中增加新的成员，用现有的接口来进行统计，</w:t>
-      </w:r>
-      <w:r>
-        <w:rPr>
-          <w:rFonts w:hint="eastAsia"/>
-        </w:rPr>
-        <w:t xml:space="preserve">rtn </w:t>
-      </w:r>
-      <w:r>
-        <w:rPr>
-          <w:rFonts w:hint="eastAsia"/>
-        </w:rPr>
-        <w:t>层通过接口来获取统计值</w:t>
-      </w:r>
-      <w:bookmarkStart w:id="12" w:name="_GoBack"/>
-      <w:bookmarkEnd w:id="12"/>
-    </w:p>
-  </w:comment>
-</w:comments>
-</file>
-
-<file path=word/commentsExtended.xml><?xml version="1.0" encoding="utf-8"?>
-<w15:commentsEx xmlns:wpc="http://schemas.microsoft.com/office/word/2010/wordprocessingCanvas" xmlns:cx="http://schemas.microsoft.com/office/drawing/2014/chartex" xmlns:mc="http://schemas.openxmlformats.org/markup-compatibility/2006" xmlns:o="urn:schemas-microsoft-com:office:office" xmlns:r="http://schemas.openxmlformats.org/officeDocument/2006/relationships" xmlns:m="http://schemas.openxmlformats.org/officeDocument/2006/math" xmlns:v="urn:schemas-microsoft-com:vml" xmlns:wp14="http://schemas.microsoft.com/office/word/2010/wordprocessingDrawing" xmlns:wp="http://schemas.openxmlformats.org/drawingml/2006/wordprocessingDrawing" xmlns:w10="urn:schemas-microsoft-com:office:word" xmlns:w="http://schemas.openxmlformats.org/wordprocessingml/2006/main" xmlns:w14="http://schemas.microsoft.com/office/word/2010/wordml" xmlns:w15="http://schemas.microsoft.com/office/word/2012/wordml" xmlns:w16se="http://schemas.microsoft.com/office/word/2015/wordml/symex" xmlns:wpg="http://schemas.microsoft.com/office/word/2010/wordprocessingGroup" xmlns:wpi="http://schemas.microsoft.com/office/word/2010/wordprocessingInk" xmlns:wne="http://schemas.microsoft.com/office/word/2006/wordml" xmlns:wps="http://schemas.microsoft.com/office/word/2010/wordprocessingShape" mc:Ignorable="w14 w15 w16se wp14">
-  <w15:commentEx w15:paraId="53AB2ABA" w15:done="0"/>
-  <w15:commentEx w15:paraId="1541A554" w15:done="0"/>
-  <w15:commentEx w15:paraId="3F2D9F4A" w15:done="0"/>
-  <w15:commentEx w15:paraId="3169FEBC" w15:done="0"/>
-  <w15:commentEx w15:paraId="45B625E7" w15:done="0"/>
-  <w15:commentEx w15:paraId="4AAE5080" w15:done="0"/>
-  <w15:commentEx w15:paraId="37838E2D" w15:done="0"/>
-  <w15:commentEx w15:paraId="4B37AFB5" w15:done="0"/>
-  <w15:commentEx w15:paraId="6325E812" w15:done="0"/>
-  <w15:commentEx w15:paraId="27EB0139" w15:done="0"/>
-</w15:commentsEx>
 </file>
 
 <file path=word/endnotes.xml><?xml version="1.0" encoding="utf-8"?>
@@ -10105,14 +9366,6 @@
     <w:abstractNumId w:val="27"/>
   </w:num>
 </w:numbering>
-</file>
-
-<file path=word/people.xml><?xml version="1.0" encoding="utf-8"?>
-<w15:people xmlns:wpc="http://schemas.microsoft.com/office/word/2010/wordprocessingCanvas" xmlns:cx="http://schemas.microsoft.com/office/drawing/2014/chartex" xmlns:mc="http://schemas.openxmlformats.org/markup-compatibility/2006" xmlns:o="urn:schemas-microsoft-com:office:office" xmlns:r="http://schemas.openxmlformats.org/officeDocument/2006/relationships" xmlns:m="http://schemas.openxmlformats.org/officeDocument/2006/math" xmlns:v="urn:schemas-microsoft-com:vml" xmlns:wp14="http://schemas.microsoft.com/office/word/2010/wordprocessingDrawing" xmlns:wp="http://schemas.openxmlformats.org/drawingml/2006/wordprocessingDrawing" xmlns:w10="urn:schemas-microsoft-com:office:word" xmlns:w="http://schemas.openxmlformats.org/wordprocessingml/2006/main" xmlns:w14="http://schemas.microsoft.com/office/word/2010/wordml" xmlns:w15="http://schemas.microsoft.com/office/word/2012/wordml" xmlns:w16se="http://schemas.microsoft.com/office/word/2015/wordml/symex" xmlns:wpg="http://schemas.microsoft.com/office/word/2010/wordprocessingGroup" xmlns:wpi="http://schemas.microsoft.com/office/word/2010/wordprocessingInk" xmlns:wne="http://schemas.microsoft.com/office/word/2006/wordml" xmlns:wps="http://schemas.microsoft.com/office/word/2010/wordprocessingShape" mc:Ignorable="w14 w15 w16se wp14">
-  <w15:person w15:author="yangshangde">
-    <w15:presenceInfo w15:providerId="None" w15:userId="yangshangde"/>
-  </w15:person>
-</w15:people>
 </file>
 
 <file path=word/styles.xml><?xml version="1.0" encoding="utf-8"?>

</xml_diff>